<commit_message>
chore(ledger): sync merged OSS publications
</commit_message>
<xml_diff>
--- a/docs/Devayan_Mandal.docx
+++ b/docs/Devayan_Mandal.docx
@@ -79,7 +79,7 @@
           <w:sz w:val="22"/>
           <w:szCs w:val="21"/>
         </w:rPr>
-        <w:t>Full Stack AI Native / Forward Deployed AI Engineer with 10 years of remote, self-directed production work. Built 30+ production-grade systems across autonomous multi-agent platforms, MCP integrations, deterministic RL evaluation, real-time observability, and high-throughput web applications. Merged 10 upstream pull requests across TypeScript, JavaScript, Python, and Rust in Recharts, pnpm, node-postgres, SQLMesh, Biome, Better Auth, thirdweb, and Anza Kit. Specializes in explicit state machines, bounded autonomy, verifiable AI systems, hybrid RAG and memory architectures, streaming infrastructure, and production-grade developer tooling, with end-to-end ownership from architecture through deployment, observability, testing, and upstream delivery.</w:t>
+        <w:t>Full Stack AI Native / Forward Deployed AI Engineer with 10 years of remote, self-directed production work. Built 30+ production-grade systems across autonomous multi-agent platforms, MCP integrations, deterministic RL evaluation, real-time observability, and high-throughput web applications. Merged 19 upstream pull requests across TypeScript, JavaScript, Python, and Rust in Recharts, pnpm, node-postgres, SQLMesh, Biome, Better Auth, thirdweb, Anza Kit, and Rspress. Specializes in explicit state machines, bounded autonomy, verifiable AI systems, hybrid RAG and memory architectures, streaming infrastructure, and production-grade developer tooling, with end-to-end ownership from architecture through deployment, observability, testing, and upstream delivery.</w:t>
       </w:r>
     </w:p>
     <w:p>
@@ -723,6 +723,168 @@
         <w:rPr>
           <w:sz w:val="18"/>
         </w:rPr>
+        <w:t>• stellar/stellar-docs #2859 (MDX) - added the --enable-core-manual-close flag to the Local section of the Network Modes page, so the parameter list no longer omits a flag the quickstart container ships, with a cross-link to the Manual close mode section noting that only the local configuration sets NODE_IS_VALIDATOR. Merged Sep 2026.</w:t>
+      </w:r>
+    </w:p>
+    <w:p>
+      <w:pPr>
+        <w:pBdr>
+          <w:bottom w:val="single" w:sz="6" w:space="1" w:color="666666"/>
+        </w:pBdr>
+        <w:spacing w:before="0" w:after="20" w:line="240" w:lineRule="auto"/>
+        <w:rPr>
+          <w:sz w:val="21"/>
+          <w:szCs w:val="21"/>
+        </w:rPr>
+      </w:pPr>
+      <w:r>
+        <w:rPr>
+          <w:sz w:val="18"/>
+        </w:rPr>
+        <w:t>• stellar/stellar-docs #2850 (MDX) - documented Quickstart's undocumented `--enable-core-manual-close` flag in the advanced usage docs, covering the `MANUAL_CLOSE` setting it writes into the generated core config, the `manualclose` endpoint that advances one ledger per call, and loopback-bound startup examples for macOS, Linux, and Windows. Merged Sep 2026.</w:t>
+      </w:r>
+    </w:p>
+    <w:p>
+      <w:pPr>
+        <w:pBdr>
+          <w:bottom w:val="single" w:sz="6" w:space="1" w:color="666666"/>
+        </w:pBdr>
+        <w:spacing w:before="0" w:after="20" w:line="240" w:lineRule="auto"/>
+        <w:rPr>
+          <w:sz w:val="21"/>
+          <w:szCs w:val="21"/>
+        </w:rPr>
+      </w:pPr>
+      <w:r>
+        <w:rPr>
+          <w:sz w:val="18"/>
+        </w:rPr>
+        <w:t>• ssf0409/tracelens #140 (Python) - markdown table cells in the report generator are now escaped with html.escape in addition to pipe and newline handling. Task ids or gate values containing pipes, line breaks, or HTML metacharacters no longer break the per-task and baseline-gate tables piped into $GITHUB_STEP_SUMMARY, and no cell can open a raw HTML element. Merged Sep 2026.</w:t>
+      </w:r>
+    </w:p>
+    <w:p>
+      <w:pPr>
+        <w:pBdr>
+          <w:bottom w:val="single" w:sz="6" w:space="1" w:color="666666"/>
+        </w:pBdr>
+        <w:spacing w:before="0" w:after="20" w:line="240" w:lineRule="auto"/>
+        <w:rPr>
+          <w:sz w:val="21"/>
+          <w:szCs w:val="21"/>
+        </w:rPr>
+      </w:pPr>
+      <w:r>
+        <w:rPr>
+          <w:sz w:val="18"/>
+        </w:rPr>
+        <w:t>• stellar/stellar-docs #2849 (MDX) - reworked the address conversion example to propagate the fallible `Result&lt;Address, ConversionError&gt;` instead of unwrapping malformed XDR, and documented that untrusted XDR must be handled rather than panicking. Merged Sep 2026.</w:t>
+      </w:r>
+    </w:p>
+    <w:p>
+      <w:pPr>
+        <w:pBdr>
+          <w:bottom w:val="single" w:sz="6" w:space="1" w:color="666666"/>
+        </w:pBdr>
+        <w:spacing w:before="0" w:after="20" w:line="240" w:lineRule="auto"/>
+        <w:rPr>
+          <w:sz w:val="21"/>
+          <w:szCs w:val="21"/>
+        </w:rPr>
+      </w:pPr>
+      <w:r>
+        <w:rPr>
+          <w:sz w:val="18"/>
+        </w:rPr>
+        <w:t>• stellar/stellar-docs #2853 (MDX) - reconciled memo framing in the pooled accounts guide so memos read as the legacy mechanism still in active use and muxed accounts as preferred going forward. Merged Sep 2026.</w:t>
+      </w:r>
+    </w:p>
+    <w:p>
+      <w:pPr>
+        <w:pBdr>
+          <w:bottom w:val="single" w:sz="6" w:space="1" w:color="666666"/>
+        </w:pBdr>
+        <w:spacing w:before="0" w:after="20" w:line="240" w:lineRule="auto"/>
+        <w:rPr>
+          <w:sz w:val="21"/>
+          <w:szCs w:val="21"/>
+        </w:rPr>
+      </w:pPr>
+      <w:r>
+        <w:rPr>
+          <w:sz w:val="18"/>
+        </w:rPr>
+        <w:t>• stellar/stellar-docs #2851 (MDX) - qualified the Freighter HTTPS requirement, noting that `http://localhost` is already a Potentially Trustworthy origin under W3C Secure Contexts so loopback needs no TLS. Merged Sep 2026.</w:t>
+      </w:r>
+    </w:p>
+    <w:p>
+      <w:pPr>
+        <w:pBdr>
+          <w:bottom w:val="single" w:sz="6" w:space="1" w:color="666666"/>
+        </w:pBdr>
+        <w:spacing w:before="0" w:after="20" w:line="240" w:lineRule="auto"/>
+        <w:rPr>
+          <w:sz w:val="21"/>
+          <w:szCs w:val="21"/>
+        </w:rPr>
+      </w:pPr>
+      <w:r>
+        <w:rPr>
+          <w:sz w:val="18"/>
+        </w:rPr>
+        <w:t>• pytest-dev/pytest-env #262 (Python) - documented that pytest.toml and .pytest.toml accept the native [pytest] env table, not only the plugin-specific [pytest_env] section. Merged Sep 2026.</w:t>
+      </w:r>
+    </w:p>
+    <w:p>
+      <w:pPr>
+        <w:pBdr>
+          <w:bottom w:val="single" w:sz="6" w:space="1" w:color="666666"/>
+        </w:pBdr>
+        <w:spacing w:before="0" w:after="20" w:line="240" w:lineRule="auto"/>
+        <w:rPr>
+          <w:sz w:val="21"/>
+          <w:szCs w:val="21"/>
+        </w:rPr>
+      </w:pPr>
+      <w:r>
+        <w:rPr>
+          <w:sz w:val="18"/>
+        </w:rPr>
+        <w:t>• pnpm/pnpm #14863 (Rust/TypeScript) - fixed startup crashes on FreeBSD and other non-Windows Unix-like platforms by making default_store_dir use the Unix fallback path; added platform-specific regression coverage. Merged Sep 2026.</w:t>
+      </w:r>
+    </w:p>
+    <w:p>
+      <w:pPr>
+        <w:pBdr>
+          <w:bottom w:val="single" w:sz="6" w:space="1" w:color="666666"/>
+        </w:pBdr>
+        <w:spacing w:before="0" w:after="20" w:line="240" w:lineRule="auto"/>
+        <w:rPr>
+          <w:sz w:val="21"/>
+          <w:szCs w:val="21"/>
+        </w:rPr>
+      </w:pPr>
+      <w:r>
+        <w:rPr>
+          <w:sz w:val="18"/>
+        </w:rPr>
+        <w:t>• web-infra-dev/rspress #3678 (TypeScript) - fixed a Search initialization race by awaiting FlexSearch addAsync indexing before LocalProvider.init() resolves, preventing early searches from incorrectly returning no results on larger sites; focused regression-oriented fix. Merged Sep 2026.</w:t>
+      </w:r>
+    </w:p>
+    <w:p>
+      <w:pPr>
+        <w:pBdr>
+          <w:bottom w:val="single" w:sz="6" w:space="1" w:color="666666"/>
+        </w:pBdr>
+        <w:spacing w:before="0" w:after="20" w:line="240" w:lineRule="auto"/>
+        <w:rPr>
+          <w:sz w:val="21"/>
+          <w:szCs w:val="21"/>
+        </w:rPr>
+      </w:pPr>
+      <w:r>
+        <w:rPr>
+          <w:sz w:val="18"/>
+        </w:rPr>
         <w:t>• recharts/recharts #7805 (TypeScript) - removed tabIndex={-1} from z-index portal SVG &lt;g&gt; layers so empty groups are not pointer-focusable and WebKit does not draw geometry-traced focus rings; added regression coverage asserting no layer carries a tabindex attribute. Merged Sep 2026.</w:t>
       </w:r>
     </w:p>
@@ -741,6 +903,60 @@
         <w:rPr>
           <w:sz w:val="18"/>
         </w:rPr>
+        <w:t>• brianc/node-postgres #3772 (JavaScript) - stopped Connection.sync() from incorrectly setting the internal _ending flag, preventing false suppression of subsequent socket errors; added unit coverage for Sync vs disconnect semantics. Merged Sep 2026.</w:t>
+      </w:r>
+    </w:p>
+    <w:p>
+      <w:pPr>
+        <w:pBdr>
+          <w:bottom w:val="single" w:sz="6" w:space="1" w:color="666666"/>
+        </w:pBdr>
+        <w:spacing w:before="0" w:after="20" w:line="240" w:lineRule="auto"/>
+        <w:rPr>
+          <w:sz w:val="21"/>
+          <w:szCs w:val="21"/>
+        </w:rPr>
+      </w:pPr>
+      <w:r>
+        <w:rPr>
+          <w:sz w:val="18"/>
+        </w:rPr>
+        <w:t>• pnpm/pnpm #14756 (Rust/TypeScript) - preserved existing dependency range operators and npm:/jsr: protocol prefixes during pnpm update, including prerelease and exact-version handling. Merged Sep 2026.</w:t>
+      </w:r>
+    </w:p>
+    <w:p>
+      <w:pPr>
+        <w:pBdr>
+          <w:bottom w:val="single" w:sz="6" w:space="1" w:color="666666"/>
+        </w:pBdr>
+        <w:spacing w:before="0" w:after="20" w:line="240" w:lineRule="auto"/>
+        <w:rPr>
+          <w:sz w:val="21"/>
+          <w:szCs w:val="21"/>
+        </w:rPr>
+      </w:pPr>
+      <w:r>
+        <w:rPr>
+          <w:sz w:val="18"/>
+        </w:rPr>
+        <w:t>• pnpm/pnpm #14754 (Rust) - fixed non-recursive pattern runs with --no-bail so matching scripts continue executing and failures are aggregated correctly; added concurrent and sequential regression tests. Merged Sep 2026.</w:t>
+      </w:r>
+    </w:p>
+    <w:p>
+      <w:pPr>
+        <w:pBdr>
+          <w:bottom w:val="single" w:sz="6" w:space="1" w:color="666666"/>
+        </w:pBdr>
+        <w:spacing w:before="0" w:after="20" w:line="240" w:lineRule="auto"/>
+        <w:rPr>
+          <w:sz w:val="21"/>
+          <w:szCs w:val="21"/>
+        </w:rPr>
+      </w:pPr>
+      <w:r>
+        <w:rPr>
+          <w:sz w:val="18"/>
+        </w:rPr>
         <w:t>• pnpm/pnpm #14753 (Rust/TypeScript) - fixed lockfile:false being ignored when automatic package-manager switching downloaded the configured engine; added unit and filesystem-backed regression coverage across Rust and TypeScript paths. Merged Sep 2026.</w:t>
       </w:r>
     </w:p>
@@ -759,7 +975,7 @@
         <w:rPr>
           <w:sz w:val="18"/>
         </w:rPr>
-        <w:t>• pnpm/pnpm #14754 (Rust) - fixed non-recursive pattern runs with --no-bail so matching scripts continue executing and failures are aggregated correctly; added concurrent and sequential regression tests. Merged Sep 2026.</w:t>
+        <w:t>• SQLMesh/sqlmesh #6040 (Python) - moved ModelTest.create_test() off concurrent worker threads to eliminate a time_machine/ttl_cache race in sqlmesh test; verified the focused race regression repeatedly. Merged Sep 2026.</w:t>
       </w:r>
     </w:p>
     <w:p>
@@ -777,7 +993,7 @@
         <w:rPr>
           <w:sz w:val="18"/>
         </w:rPr>
-        <w:t>• pnpm/pnpm #14756 (Rust/TypeScript) - preserved existing dependency range operators and npm:/jsr: protocol prefixes during pnpm update, including prerelease and exact-version handling. Merged Sep 2026.</w:t>
+        <w:t>• anza-xyz/kit #2032 (TypeScript) - restored number predicates in the getPatternMatchCodec advanced guide to match current codec typing. Merged Sep 2026.</w:t>
       </w:r>
     </w:p>
     <w:p>
@@ -795,7 +1011,7 @@
         <w:rPr>
           <w:sz w:val="18"/>
         </w:rPr>
-        <w:t>• brianc/node-postgres #3772 (JavaScript) - stopped Connection.sync() from incorrectly setting the internal _ending flag, preventing false suppression of subsequent socket errors; added unit coverage for Sync vs disconnect semantics. Merged Sep 2026.</w:t>
+        <w:t>• better-auth/better-auth #11208 (TypeScript) - added regression coverage locking the /phone-number/verify OpenAPI requestBody after a Zod .and(z.record()) intersection; tests only, no production generator changes. Merged Sep 2026.</w:t>
       </w:r>
     </w:p>
     <w:p>
@@ -813,7 +1029,7 @@
         <w:rPr>
           <w:sz w:val="18"/>
         </w:rPr>
-        <w:t>• SQLMesh/sqlmesh #6040 (Python) - moved ModelTest.create_test() off concurrent worker threads to eliminate a time_machine/ttl_cache race in sqlmesh test; verified the focused race regression repeatedly. Merged Sep 2026.</w:t>
+        <w:t>• biomejs/biome #11667 (Rust) - ported the unicorn better-dom-traversing rule into Biome's nursery linter; +1,972 lines across 17 files and 7 commits, released to 13 packages via changeset. Merged Sep 2026.</w:t>
       </w:r>
     </w:p>
     <w:p>
@@ -831,7 +1047,7 @@
         <w:rPr>
           <w:sz w:val="18"/>
         </w:rPr>
-        <w:t>• biomejs/biome #11667 (Rust) - ported the unicorn better-dom-traversing rule into Biome's nursery linter; +1,972 lines across 17 files and 7 commits, released to 13 packages via changeset. Merged Sep 2026.</w:t>
+        <w:t>• thirdweb-dev/js #8938 (TypeScript) - fixed useTokenQuery error handling so 401/429/timeout failures rethrow instead of rendering a false "Token Not Supported" state in CheckoutWidget; added tests and a patch changeset. Merged Sep 2026.</w:t>
       </w:r>
     </w:p>
     <w:p>
@@ -849,60 +1065,7 @@
         <w:rPr>
           <w:sz w:val="18"/>
         </w:rPr>
-        <w:t>• better-auth/better-auth #11208 (TypeScript) - added regression coverage locking the /phone-number/verify OpenAPI requestBody after a Zod .and(z.record()) intersection; tests only, no production generator changes. Merged Sep 2026.</w:t>
-      </w:r>
-    </w:p>
-    <w:p>
-      <w:pPr>
-        <w:pBdr>
-          <w:bottom w:val="single" w:sz="6" w:space="1" w:color="666666"/>
-        </w:pBdr>
-        <w:spacing w:before="0" w:after="20" w:line="240" w:lineRule="auto"/>
-        <w:rPr>
-          <w:sz w:val="21"/>
-          <w:szCs w:val="21"/>
-        </w:rPr>
-      </w:pPr>
-      <w:r>
-        <w:rPr>
-          <w:sz w:val="18"/>
-        </w:rPr>
-        <w:t>• thirdweb-dev/js #8938 (TypeScript) - fixed useTokenQuery error handling so 401/429/timeout failures rethrow instead of rendering a false "Token Not Supported" state in CheckoutWidget; added tests and a patch changeset. Merged Sep 2026.</w:t>
-      </w:r>
-    </w:p>
-    <w:p>
-      <w:pPr>
-        <w:pBdr>
-          <w:bottom w:val="single" w:sz="6" w:space="1" w:color="666666"/>
-        </w:pBdr>
-        <w:spacing w:before="0" w:after="20" w:line="240" w:lineRule="auto"/>
-        <w:rPr>
-          <w:sz w:val="21"/>
-          <w:szCs w:val="21"/>
-        </w:rPr>
-      </w:pPr>
-      <w:r>
-        <w:rPr>
-          <w:sz w:val="18"/>
-        </w:rPr>
-        <w:t>• anza-xyz/kit #2032 (TypeScript) - restored number predicates in the getPatternMatchCodec advanced guide to match current codec typing. Merged Sep 2026.</w:t>
-      </w:r>
-    </w:p>
-    <w:p>
-      <w:pPr>
-        <w:pBdr>
-          <w:bottom w:val="single" w:sz="6" w:space="1" w:color="666666"/>
-        </w:pBdr>
-        <w:spacing w:before="0" w:after="20" w:line="240" w:lineRule="auto"/>
-        <w:rPr>
-          <w:sz w:val="21"/>
-          <w:szCs w:val="21"/>
-        </w:rPr>
-      </w:pPr>
-      <w:r>
-        <w:rPr>
-          <w:sz w:val="18"/>
-        </w:rPr>
+        <w:t xml:space="preserve"/>
       </w:r>
     </w:p>
     <w:p>

</xml_diff>

<commit_message>
docs: wire Credly links into resume certs, sort newest-first
</commit_message>
<xml_diff>
--- a/docs/Devayan_Mandal.docx
+++ b/docs/Devayan_Mandal.docx
@@ -1,8 +1,8 @@
 
 <file path=word/document.xml><?xml version="1.0" encoding="utf-8"?>
-<w:document xmlns:wpc="http://schemas.microsoft.com/office/word/2010/wordprocessingCanvas" xmlns:cx="http://schemas.microsoft.com/office/drawing/2014/chartex" xmlns:cx1="http://schemas.microsoft.com/office/drawing/2015/9/8/chartex" xmlns:cx2="http://schemas.microsoft.com/office/drawing/2015/10/21/chartex" xmlns:cx3="http://schemas.microsoft.com/office/drawing/2016/5/9/chartex" xmlns:cx4="http://schemas.microsoft.com/office/drawing/2016/5/10/chartex" xmlns:cx5="http://schemas.microsoft.com/office/drawing/2016/5/11/chartex" xmlns:cx6="http://schemas.microsoft.com/office/drawing/2016/5/12/chartex" xmlns:cx7="http://schemas.microsoft.com/office/drawing/2016/5/13/chartex" xmlns:cx8="http://schemas.microsoft.com/office/drawing/2016/5/14/chartex" xmlns:mc="http://schemas.openxmlformats.org/markup-compatibility/2006" xmlns:aink="http://schemas.microsoft.com/office/drawing/2016/ink" xmlns:am3d="http://schemas.microsoft.com/office/drawing/2017/model3d" xmlns:o="urn:schemas-microsoft-com:office:office" xmlns:oel="http://schemas.microsoft.com/office/2019/extlst" xmlns:r="http://schemas.openxmlformats.org/officeDocument/2006/relationships" xmlns:m="http://schemas.openxmlformats.org/officeDocument/2006/math" xmlns:v="urn:schemas-microsoft-com:vml" xmlns:wp14="http://schemas.microsoft.com/office/word/2010/wordprocessingDrawing" xmlns:wp="http://schemas.openxmlformats.org/drawingml/2006/wordprocessingDrawing" xmlns:w10="urn:schemas-microsoft-com:office:word" xmlns:w="http://schemas.openxmlformats.org/wordprocessingml/2006/main" xmlns:w14="http://schemas.microsoft.com/office/word/2010/wordml" xmlns:w15="http://schemas.microsoft.com/office/word/2012/wordml" xmlns:w16cex="http://schemas.microsoft.com/office/word/2018/wordml/cex" xmlns:w16cid="http://schemas.microsoft.com/office/word/2016/wordml/cid" xmlns:w16="http://schemas.microsoft.com/office/word/2018/wordml" xmlns:w16du="http://schemas.microsoft.com/office/word/2023/wordml/word16du" xmlns:w16sdtdh="http://schemas.microsoft.com/office/word/2020/wordml/sdtdatahash" xmlns:w16sdtfl="http://schemas.microsoft.com/office/word/2024/wordml/sdtformatlock" xmlns:w16se="http://schemas.microsoft.com/office/word/2015/wordml/symex" xmlns:wpg="http://schemas.microsoft.com/office/word/2010/wordprocessingGroup" xmlns:wpi="http://schemas.microsoft.com/office/word/2010/wordprocessingInk" xmlns:wne="http://schemas.microsoft.com/office/word/2006/wordml" xmlns:wps="http://schemas.microsoft.com/office/word/2010/wordprocessingShape" mc:Ignorable="w14 w15 w16se w16cid w16 w16cex w16sdtdh w16sdtfl w16du wp14">
+<w:document xmlns:mc="http://schemas.openxmlformats.org/markup-compatibility/2006" xmlns:ns2="http://schemas.microsoft.com/office/word/2010/wordml" xmlns:r="http://schemas.openxmlformats.org/officeDocument/2006/relationships" xmlns:w="http://schemas.openxmlformats.org/wordprocessingml/2006/main" mc:Ignorable="w14 w15 w16se w16cid w16 w16cex w16sdtdh w16sdtfl w16du wp14">
   <w:body>
-    <w:p>
+    <w:p ns2:paraId="2EA2A59B" ns2:textId="13E5B618">
       <w:pPr>
         <w:spacing w:after="40" w:line="240" w:lineRule="auto"/>
         <w:jc w:val="center"/>
@@ -49,7 +49,7 @@
         <w:t>andal</w:t>
       </w:r>
     </w:p>
-    <w:p>
+    <w:p ns2:paraId="30B7F3EA" ns2:textId="77777777">
       <w:pPr>
         <w:spacing w:after="40" w:line="240" w:lineRule="auto"/>
         <w:jc w:val="center"/>
@@ -64,7 +64,7 @@
         <w:t>Full Stack AI Native / Forward Deployed AI Engineer &amp; Open-Source Contributor - Open to Remote Work</w:t>
       </w:r>
     </w:p>
-    <w:p>
+    <w:p ns2:paraId="1C153239" ns2:textId="77777777">
       <w:pPr>
         <w:spacing w:after="200" w:line="240" w:lineRule="auto"/>
         <w:jc w:val="center"/>
@@ -125,7 +125,7 @@
         <w:proofErr w:type="spellEnd"/>
       </w:hyperlink>
     </w:p>
-    <w:p>
+    <w:p ns2:paraId="743482DB" ns2:textId="343F6123">
       <w:pPr>
         <w:pBdr>
           <w:bottom w:val="single" w:sz="6" w:space="1" w:color="666666"/>
@@ -164,7 +164,7 @@
         <w:t>ummary</w:t>
       </w:r>
     </w:p>
-    <w:p>
+    <w:p ns2:paraId="1D8CF6B5" ns2:textId="77777777">
       <w:pPr>
         <w:spacing w:after="60" w:line="240" w:lineRule="auto"/>
         <w:rPr>
@@ -200,7 +200,7 @@
         <w:t xml:space="preserve"> infra.</w:t>
       </w:r>
     </w:p>
-    <w:p>
+    <w:p ns2:paraId="43E14E01" ns2:textId="591BC61E">
       <w:pPr>
         <w:spacing w:after="60" w:line="240" w:lineRule="auto"/>
         <w:rPr>
@@ -254,7 +254,7 @@
         <w:t xml:space="preserve"> and others; owned root cause to release.</w:t>
       </w:r>
     </w:p>
-    <w:p>
+    <w:p ns2:paraId="357A4472" ns2:textId="34676910">
       <w:pPr>
         <w:pBdr>
           <w:bottom w:val="single" w:sz="6" w:space="1" w:color="666666"/>
@@ -293,7 +293,7 @@
         <w:t>kills</w:t>
       </w:r>
     </w:p>
-    <w:p>
+    <w:p ns2:paraId="2EA09937" ns2:textId="77777777">
       <w:pPr>
         <w:spacing w:after="50" w:line="240" w:lineRule="auto"/>
         <w:ind w:left="180" w:hanging="180"/>
@@ -312,7 +312,7 @@
         <w:t>• Languages: Python, TypeScript, JavaScript, Rust, SQL, Bash</w:t>
       </w:r>
     </w:p>
-    <w:p>
+    <w:p ns2:paraId="6222979D" ns2:textId="77777777">
       <w:pPr>
         <w:spacing w:after="50" w:line="240" w:lineRule="auto"/>
         <w:ind w:left="180" w:hanging="180"/>
@@ -349,7 +349,7 @@
         <w:t>, Gemini, OpenAI</w:t>
       </w:r>
     </w:p>
-    <w:p>
+    <w:p ns2:paraId="641F4A8F" ns2:textId="77777777">
       <w:pPr>
         <w:spacing w:after="50" w:line="240" w:lineRule="auto"/>
         <w:ind w:left="180" w:hanging="180"/>
@@ -368,7 +368,7 @@
         <w:t>• Frontend: React 19, Next.js 16, TanStack, Tailwind v4, Vite, Expo, Three.js</w:t>
       </w:r>
     </w:p>
-    <w:p>
+    <w:p ns2:paraId="1F7C38B4" ns2:textId="77777777">
       <w:pPr>
         <w:spacing w:after="50" w:line="240" w:lineRule="auto"/>
         <w:ind w:left="180" w:hanging="180"/>
@@ -415,7 +415,7 @@
       </w:r>
       <w:proofErr w:type="spellEnd"/>
     </w:p>
-    <w:p>
+    <w:p ns2:paraId="7B980251" ns2:textId="77777777">
       <w:pPr>
         <w:spacing w:after="50" w:line="240" w:lineRule="auto"/>
         <w:ind w:left="180" w:hanging="180"/>
@@ -480,7 +480,7 @@
       </w:r>
       <w:proofErr w:type="spellEnd"/>
     </w:p>
-    <w:p>
+    <w:p ns2:paraId="119DCEB8" ns2:textId="77777777">
       <w:pPr>
         <w:spacing w:after="50" w:line="240" w:lineRule="auto"/>
         <w:ind w:left="180" w:hanging="180"/>
@@ -535,7 +535,7 @@
         <w:t>, Playwright</w:t>
       </w:r>
     </w:p>
-    <w:p>
+    <w:p ns2:paraId="6E1034E5" ns2:textId="77777777">
       <w:pPr>
         <w:spacing w:after="50" w:line="240" w:lineRule="auto"/>
         <w:ind w:left="180" w:hanging="180"/>
@@ -590,7 +590,7 @@
         <w:t>, Safe, Base L2</w:t>
       </w:r>
     </w:p>
-    <w:p>
+    <w:p ns2:paraId="7ECA1D0A" ns2:textId="77777777">
       <w:pPr>
         <w:spacing w:after="50" w:line="240" w:lineRule="auto"/>
         <w:ind w:left="180" w:hanging="180"/>
@@ -609,7 +609,7 @@
         <w:t>• Practices: Six Sigma, bounded autonomy, cost-aware routing, Git, Changesets</w:t>
       </w:r>
     </w:p>
-    <w:p>
+    <w:p ns2:paraId="2AC8FF8C" ns2:textId="681C41FB">
       <w:pPr>
         <w:pBdr>
           <w:bottom w:val="single" w:sz="6" w:space="1" w:color="666666"/>
@@ -648,7 +648,7 @@
         <w:t>xperience</w:t>
       </w:r>
     </w:p>
-    <w:p>
+    <w:p ns2:paraId="7C005B86" ns2:textId="4A396FA2">
       <w:pPr>
         <w:spacing w:before="120" w:after="10" w:line="240" w:lineRule="auto"/>
         <w:rPr>
@@ -700,7 +700,7 @@
         <w:t>Merged Open-Source Contributions</w:t>
       </w:r>
     </w:p>
-    <w:p>
+    <w:p ns2:paraId="34C41054" ns2:textId="2490F7D2">
       <w:pPr>
         <w:spacing w:after="50" w:line="240" w:lineRule="auto"/>
         <w:ind w:left="180" w:hanging="180"/>
@@ -778,7 +778,7 @@
         <w:t>-traversing rule to nursery; 1,972 lines, 13 packages.</w:t>
       </w:r>
     </w:p>
-    <w:p>
+    <w:p ns2:paraId="60B328AD" ns2:textId="77777777">
       <w:pPr>
         <w:spacing w:after="50" w:line="240" w:lineRule="auto"/>
         <w:ind w:left="180" w:hanging="180"/>
@@ -851,7 +851,7 @@
         <w:t xml:space="preserve"> (Rust/TypeScript) - fixed FreeBSD/Unix startup crash via Unix fallback store path.</w:t>
       </w:r>
     </w:p>
-    <w:p>
+    <w:p ns2:paraId="542C5D99" ns2:textId="77777777">
       <w:pPr>
         <w:spacing w:after="50" w:line="240" w:lineRule="auto"/>
         <w:ind w:left="180" w:hanging="180"/>
@@ -942,7 +942,7 @@
         <w:t>() setting _ending flag and hiding socket errors.</w:t>
       </w:r>
     </w:p>
-    <w:p>
+    <w:p ns2:paraId="450F8DE0" ns2:textId="77777777">
       <w:pPr>
         <w:spacing w:after="50" w:line="240" w:lineRule="auto"/>
         <w:ind w:left="180" w:hanging="180"/>
@@ -999,7 +999,7 @@
         <w:t xml:space="preserve"> from portal SVG groups to stop false focus rings; added test.</w:t>
       </w:r>
     </w:p>
-    <w:p>
+    <w:p ns2:paraId="00C2954F" ns2:textId="77777777">
       <w:pPr>
         <w:spacing w:after="50" w:line="240" w:lineRule="auto"/>
         <w:ind w:left="180" w:hanging="180"/>
@@ -1060,7 +1060,7 @@
         <w:t xml:space="preserve"> (Rust) - fixed Windows interpreter crash on non-UTF-8 output via from_utf8_lossy; added decode test.</w:t>
       </w:r>
     </w:p>
-    <w:p>
+    <w:p ns2:paraId="43E69D63" ns2:textId="77777777">
       <w:pPr>
         <w:spacing w:after="50" w:line="240" w:lineRule="auto"/>
         <w:ind w:left="180" w:hanging="180"/>
@@ -1169,7 +1169,7 @@
         <w:t xml:space="preserve"> race.</w:t>
       </w:r>
     </w:p>
-    <w:p>
+    <w:p ns2:paraId="0130C6D2" ns2:textId="77777777">
       <w:pPr>
         <w:spacing w:after="50" w:line="240" w:lineRule="auto"/>
         <w:ind w:left="180" w:hanging="180"/>
@@ -1262,7 +1262,7 @@
         <w:t xml:space="preserve"> during auto package-manager switch.</w:t>
       </w:r>
     </w:p>
-    <w:p>
+    <w:p ns2:paraId="47481BCA" ns2:textId="77777777">
       <w:pPr>
         <w:spacing w:after="50" w:line="240" w:lineRule="auto"/>
         <w:ind w:left="180" w:hanging="180"/>
@@ -1319,7 +1319,7 @@
         <w:t xml:space="preserve"> regression test for phone verify body; tests only.</w:t>
       </w:r>
     </w:p>
-    <w:p>
+    <w:p ns2:paraId="345EE263" ns2:textId="77777777">
       <w:pPr>
         <w:spacing w:after="50" w:line="240" w:lineRule="auto"/>
         <w:ind w:left="180" w:hanging="180"/>
@@ -1410,7 +1410,7 @@
         <w:t xml:space="preserve"> to rethrow 401/429/timeout instead of false unsupported.</w:t>
       </w:r>
     </w:p>
-    <w:p>
+    <w:p ns2:paraId="371FB247" ns2:textId="77777777">
       <w:pPr>
         <w:spacing w:after="50" w:line="240" w:lineRule="auto"/>
         <w:ind w:left="180" w:hanging="180"/>
@@ -1479,7 +1479,7 @@
         <w:t xml:space="preserve"> guide.</w:t>
       </w:r>
     </w:p>
-    <w:p>
+    <w:p ns2:paraId="56071E1D" ns2:textId="77777777">
       <w:pPr>
         <w:spacing w:after="50" w:line="240" w:lineRule="auto"/>
         <w:ind w:left="180" w:hanging="180"/>
@@ -1558,7 +1558,7 @@
         <w:t xml:space="preserve"> indexing before init.</w:t>
       </w:r>
     </w:p>
-    <w:p>
+    <w:p ns2:paraId="6A1B33F2" ns2:textId="77777777">
       <w:pPr>
         <w:spacing w:after="50" w:line="240" w:lineRule="auto"/>
         <w:ind w:left="180" w:hanging="180"/>
@@ -1667,7 +1667,7 @@
         <w:t>: prefixes during update.</w:t>
       </w:r>
     </w:p>
-    <w:p>
+    <w:p ns2:paraId="30A4BCF5" ns2:textId="77777777">
       <w:pPr>
         <w:spacing w:after="50" w:line="240" w:lineRule="auto"/>
         <w:ind w:left="180" w:hanging="180"/>
@@ -1778,7 +1778,7 @@
         <w:t>] env table.</w:t>
       </w:r>
     </w:p>
-    <w:p>
+    <w:p ns2:paraId="3AF1C803" ns2:textId="77777777">
       <w:pPr>
         <w:spacing w:after="50" w:line="240" w:lineRule="auto"/>
         <w:ind w:left="180" w:hanging="180"/>
@@ -1835,7 +1835,7 @@
         <w:t xml:space="preserve"> endpoint.</w:t>
       </w:r>
     </w:p>
-    <w:p>
+    <w:p ns2:paraId="68930017" ns2:textId="77777777">
       <w:pPr>
         <w:spacing w:after="50" w:line="240" w:lineRule="auto"/>
         <w:ind w:left="180" w:hanging="180"/>
@@ -1896,7 +1896,7 @@
         <w:t xml:space="preserve"> (Python) - added configurable comment-verbosity check on added lines only.</w:t>
       </w:r>
     </w:p>
-    <w:p>
+    <w:p ns2:paraId="6A776CDC" ns2:textId="77777777">
       <w:pPr>
         <w:spacing w:after="50" w:line="240" w:lineRule="auto"/>
         <w:ind w:left="180" w:hanging="180"/>
@@ -1935,7 +1935,7 @@
         <w:t xml:space="preserve"> (MDX) - fixed address example to propagate Result instead of unwrapping bad XDR.</w:t>
       </w:r>
     </w:p>
-    <w:p>
+    <w:p ns2:paraId="02983374" ns2:textId="77777777">
       <w:pPr>
         <w:spacing w:after="50" w:line="240" w:lineRule="auto"/>
         <w:ind w:left="180" w:hanging="180"/>
@@ -1996,7 +1996,7 @@
         <w:t xml:space="preserve"> (Python) - aligned DESIGN.md 10.14 Hunk entry.</w:t>
       </w:r>
     </w:p>
-    <w:p>
+    <w:p ns2:paraId="23FAA276" ns2:textId="77777777">
       <w:pPr>
         <w:spacing w:after="50" w:line="240" w:lineRule="auto"/>
         <w:ind w:left="180" w:hanging="180"/>
@@ -2079,7 +2079,7 @@
         <w:t xml:space="preserve"> (TypeScript) - extended docs pipeline to migration pages: Starlight sidebar.</w:t>
       </w:r>
     </w:p>
-    <w:p>
+    <w:p ns2:paraId="613760FC" ns2:textId="62F471E9">
       <w:pPr>
         <w:spacing w:after="50" w:line="240" w:lineRule="auto"/>
         <w:ind w:left="180" w:hanging="180"/>
@@ -2149,7 +2149,7 @@
         <w:t xml:space="preserve"> at EOF so output stays valid TOML.</w:t>
       </w:r>
     </w:p>
-    <w:p>
+    <w:p ns2:paraId="24908568" ns2:textId="77777777">
       <w:pPr>
         <w:spacing w:after="50" w:line="240" w:lineRule="auto"/>
         <w:ind w:left="180" w:hanging="180"/>
@@ -2200,7 +2200,7 @@
         <w:t xml:space="preserve"> (Rust) - fixed insert offset to full-manifest coordinates.</w:t>
       </w:r>
     </w:p>
-    <w:p>
+    <w:p ns2:paraId="575AA2CC" ns2:textId="77777777">
       <w:pPr>
         <w:spacing w:after="50" w:line="240" w:lineRule="auto"/>
         <w:ind w:left="180" w:hanging="180"/>
@@ -2299,7 +2299,7 @@
         <w:t xml:space="preserve"> checks.</w:t>
       </w:r>
     </w:p>
-    <w:p>
+    <w:p ns2:paraId="4B2458E8" ns2:textId="77777777">
       <w:pPr>
         <w:spacing w:after="50" w:line="240" w:lineRule="auto"/>
         <w:ind w:left="180" w:hanging="180"/>
@@ -2372,7 +2372,7 @@
         <w:t xml:space="preserve"> (Rust) - fixed --no-bail pattern runs to continue and aggregate failures.</w:t>
       </w:r>
     </w:p>
-    <w:p>
+    <w:p ns2:paraId="4C738C3B" ns2:textId="77777777">
       <w:pPr>
         <w:spacing w:after="50" w:line="240" w:lineRule="auto"/>
         <w:ind w:left="180" w:hanging="180"/>
@@ -2411,7 +2411,7 @@
         <w:t xml:space="preserve"> (MDX) - added missing --enable-core-manual-close flag to Network Modes Local section.</w:t>
       </w:r>
     </w:p>
-    <w:p>
+    <w:p ns2:paraId="07D78602" ns2:textId="77777777">
       <w:pPr>
         <w:spacing w:after="50" w:line="240" w:lineRule="auto"/>
         <w:ind w:left="180" w:hanging="180"/>
@@ -2492,7 +2492,7 @@
         <w:t xml:space="preserve"> so pipes/HTML cannot break summary tables.</w:t>
       </w:r>
     </w:p>
-    <w:p>
+    <w:p ns2:paraId="723CB4A5" ns2:textId="77777777">
       <w:pPr>
         <w:spacing w:after="50" w:line="240" w:lineRule="auto"/>
         <w:ind w:left="180" w:hanging="180"/>
@@ -2549,7 +2549,7 @@
         <w:t xml:space="preserve"> preferred.</w:t>
       </w:r>
     </w:p>
-    <w:p>
+    <w:p ns2:paraId="1DEB0771" ns2:textId="77777777">
       <w:pPr>
         <w:spacing w:after="50" w:line="240" w:lineRule="auto"/>
         <w:ind w:left="180" w:hanging="180"/>
@@ -2606,7 +2606,7 @@
         <w:t xml:space="preserve"> no TLS needed for Freighter.</w:t>
       </w:r>
     </w:p>
-    <w:p>
+    <w:p ns2:paraId="7C5773DA" ns2:textId="77777777">
       <w:pPr>
         <w:spacing w:after="60" w:line="240" w:lineRule="auto"/>
         <w:rPr>
@@ -2617,7 +2617,7 @@
         </w:rPr>
       </w:pPr>
     </w:p>
-    <w:p>
+    <w:p ns2:paraId="19F4340E" ns2:textId="4617063F">
       <w:pPr>
         <w:spacing w:after="60" w:line="240" w:lineRule="auto"/>
         <w:rPr>
@@ -2632,7 +2632,7 @@
         <w:t>Full Stack AI Native / Forward Deployed AI Engineer | June 2026 - Present | Remote</w:t>
       </w:r>
     </w:p>
-    <w:p>
+    <w:p ns2:paraId="487DCCE2" ns2:textId="77777777">
       <w:pPr>
         <w:spacing w:after="50" w:line="240" w:lineRule="auto"/>
         <w:ind w:left="180" w:hanging="180"/>
@@ -2669,7 +2669,7 @@
         <w:t xml:space="preserve"> observability, and web apps.</w:t>
       </w:r>
     </w:p>
-    <w:p>
+    <w:p ns2:paraId="1D29E51A" ns2:textId="77777777">
       <w:pPr>
         <w:spacing w:after="50" w:line="240" w:lineRule="auto"/>
         <w:ind w:left="180" w:hanging="180"/>
@@ -2706,7 +2706,7 @@
         <w:t xml:space="preserve"> evals, SSE dashboard.</w:t>
       </w:r>
     </w:p>
-    <w:p>
+    <w:p ns2:paraId="6B46D89B" ns2:textId="77777777">
       <w:pPr>
         <w:spacing w:after="50" w:line="240" w:lineRule="auto"/>
         <w:ind w:left="180" w:hanging="180"/>
@@ -2743,7 +2743,7 @@
         <w:t xml:space="preserve"> traces).</w:t>
       </w:r>
     </w:p>
-    <w:p>
+    <w:p ns2:paraId="17F09B10" ns2:textId="77777777">
       <w:pPr>
         <w:spacing w:after="50" w:line="240" w:lineRule="auto"/>
         <w:ind w:left="180" w:hanging="180"/>
@@ -2780,7 +2780,7 @@
         <w:t xml:space="preserve"> (calendar-math, meeting-slot, unit-fix): sweep-line solvers, sandboxed graders, no LLM judge.</w:t>
       </w:r>
     </w:p>
-    <w:p>
+    <w:p ns2:paraId="047965E5" ns2:textId="77777777">
       <w:pPr>
         <w:spacing w:after="50" w:line="240" w:lineRule="auto"/>
         <w:ind w:left="180" w:hanging="180"/>
@@ -2871,7 +2871,7 @@
         <w:t xml:space="preserve"> Challenge 2026).</w:t>
       </w:r>
     </w:p>
-    <w:p>
+    <w:p ns2:paraId="4046B4B2" ns2:textId="77777777">
       <w:pPr>
         <w:spacing w:after="50" w:line="240" w:lineRule="auto"/>
         <w:ind w:left="180" w:hanging="180"/>
@@ -2908,7 +2908,7 @@
         <w:t>: 5,000+ open roles across Greenhouse/Ashby/Lever; TanStack Start, React 19, Neon Postgres, Expo, 4x-daily crawls. Live: jobrow.vercel.app</w:t>
       </w:r>
     </w:p>
-    <w:p>
+    <w:p ns2:paraId="738ED479" ns2:textId="16258D27">
       <w:pPr>
         <w:spacing w:after="50" w:line="240" w:lineRule="auto"/>
         <w:ind w:left="180" w:hanging="180"/>
@@ -2927,7 +2927,7 @@
         <w:t>• Veritas (research agent), Cadence (healthcare, 5-layer memory), chaos platform (self-healing, WebSocket telemetry).</w:t>
       </w:r>
     </w:p>
-    <w:p>
+    <w:p ns2:paraId="6A8D4D4D" ns2:textId="21718839">
       <w:pPr>
         <w:spacing w:after="50" w:line="240" w:lineRule="auto"/>
         <w:ind w:left="180" w:hanging="180"/>
@@ -2946,18 +2946,18 @@
         <w:t>• AI-native full stack with frontier models: fast iteration, test-driven validation, repo norms, reproducible upstream delivery.</w:t>
       </w:r>
     </w:p>
-    <w:p>
-      <w:pPr>
-        <w:spacing w:after="50" w:line="240" w:lineRule="auto"/>
-        <w:ind w:left="180" w:hanging="180"/>
-        <w:rPr>
-          <w:rFonts w:ascii="Arial" w:hAnsi="Arial" w:cs="Arial"/>
-          <w:sz w:val="22"/>
-          <w:szCs w:val="22"/>
-        </w:rPr>
-      </w:pPr>
-    </w:p>
-    <w:p>
+    <w:p ns2:paraId="29A43009" ns2:textId="77777777">
+      <w:pPr>
+        <w:spacing w:after="50" w:line="240" w:lineRule="auto"/>
+        <w:ind w:left="180" w:hanging="180"/>
+        <w:rPr>
+          <w:rFonts w:ascii="Arial" w:hAnsi="Arial" w:cs="Arial"/>
+          <w:sz w:val="22"/>
+          <w:szCs w:val="22"/>
+        </w:rPr>
+      </w:pPr>
+    </w:p>
+    <w:p ns2:paraId="49DB7C82" ns2:textId="77777777">
       <w:pPr>
         <w:spacing w:after="60" w:line="240" w:lineRule="auto"/>
         <w:rPr>
@@ -2975,7 +2975,7 @@
         <w:t>Quantitative Crypto Trader &amp; Derivatives Strategist | September 2016 - Present | Remote</w:t>
       </w:r>
     </w:p>
-    <w:p>
+    <w:p ns2:paraId="04445289" ns2:textId="77777777">
       <w:pPr>
         <w:spacing w:after="50" w:line="240" w:lineRule="auto"/>
         <w:ind w:left="180" w:hanging="180"/>
@@ -2994,7 +2994,7 @@
         <w:t>• Manage diversified proprietary capital across tier-1 exchanges including Binance, Coinbase, Bitget.</w:t>
       </w:r>
     </w:p>
-    <w:p>
+    <w:p ns2:paraId="4C1EF3F0" ns2:textId="77777777">
       <w:pPr>
         <w:spacing w:after="50" w:line="240" w:lineRule="auto"/>
         <w:ind w:left="180" w:hanging="180"/>
@@ -3013,7 +3013,7 @@
         <w:t>• Built and ran automated grid, DCA, and Martingale bots on Pionex and Binance to capture spread and volatility in ranging markets.</w:t>
       </w:r>
     </w:p>
-    <w:p>
+    <w:p ns2:paraId="5A81116E" ns2:textId="77777777">
       <w:pPr>
         <w:spacing w:after="50" w:line="240" w:lineRule="auto"/>
         <w:ind w:left="180" w:hanging="180"/>
@@ -3032,7 +3032,7 @@
         <w:t>• Executed delta-neutral basis and funding-rate arbitrage between spot and perpetuals, plus concentrated-liquidity and lending-loop strategies on-chain.</w:t>
       </w:r>
     </w:p>
-    <w:p>
+    <w:p ns2:paraId="2486A199" ns2:textId="77777777">
       <w:pPr>
         <w:spacing w:after="50" w:line="240" w:lineRule="auto"/>
         <w:ind w:left="180" w:hanging="180"/>
@@ -3069,7 +3069,7 @@
         <w:t xml:space="preserve"> limits, drawdown caps, and Sharpe-ratio optimization governing position sizing and portfolio.</w:t>
       </w:r>
     </w:p>
-    <w:p>
+    <w:p ns2:paraId="5BF22EFD" ns2:textId="7AA5F2DA">
       <w:pPr>
         <w:pBdr>
           <w:bottom w:val="single" w:sz="6" w:space="1" w:color="666666"/>
@@ -3094,7 +3094,7 @@
         <w:t>ertifications</w:t>
       </w:r>
     </w:p>
-    <w:p>
+    <w:p ns2:paraId="750199E4" ns2:textId="3E75D6B1">
       <w:pPr>
         <w:spacing w:after="50" w:line="240" w:lineRule="auto"/>
         <w:ind w:left="180" w:hanging="180"/>
@@ -3132,7 +3132,7 @@
         <w:t>: Advanced Topics - Anthropic, 2026</w:t>
       </w:r>
     </w:p>
-    <w:p>
+    <w:p ns2:paraId="5979B4F1" ns2:textId="3E88C790">
       <w:pPr>
         <w:spacing w:after="50" w:line="240" w:lineRule="auto"/>
         <w:ind w:left="180" w:hanging="180"/>
@@ -3170,7 +3170,7 @@
         <w:t xml:space="preserve"> - Anthropic (with CodePath), 2026</w:t>
       </w:r>
     </w:p>
-    <w:p>
+    <w:p ns2:paraId="2D1F57CB" ns2:textId="6377C20D">
       <w:pPr>
         <w:spacing w:after="50" w:line="240" w:lineRule="auto"/>
         <w:ind w:left="180" w:hanging="180"/>
@@ -3208,7 +3208,7 @@
         <w:t xml:space="preserve"> - OpenAI Academy, 2026</w:t>
       </w:r>
     </w:p>
-    <w:p>
+    <w:p ns2:paraId="2677E336" ns2:textId="0913D9DA">
       <w:pPr>
         <w:spacing w:after="50" w:line="240" w:lineRule="auto"/>
         <w:ind w:left="180" w:hanging="180"/>
@@ -3246,7 +3246,7 @@
         <w:t xml:space="preserve"> - LangChain Academy, 2026</w:t>
       </w:r>
     </w:p>
-    <w:p>
+    <w:p ns2:paraId="605447A3" ns2:textId="0A65C822">
       <w:pPr>
         <w:spacing w:after="50" w:line="240" w:lineRule="auto"/>
         <w:ind w:left="180" w:hanging="180"/>
@@ -3284,7 +3284,7 @@
         <w:t xml:space="preserve"> - LangChain Academy, 2026</w:t>
       </w:r>
     </w:p>
-    <w:p>
+    <w:p ns2:paraId="07FF0290" ns2:textId="211EA98B">
       <w:pPr>
         <w:spacing w:after="50" w:line="240" w:lineRule="auto"/>
         <w:ind w:left="180" w:hanging="180"/>
@@ -3302,6 +3302,62 @@
         </w:rPr>
         <w:t xml:space="preserve">• </w:t>
       </w:r>
+      <w:hyperlink r:id="rId45" w:history="1">
+        <w:r>
+          <w:rPr>
+            <w:rStyle w:val="Hyperlink"/>
+            <w:rFonts w:ascii="Arial" w:hAnsi="Arial" w:cs="Arial"/>
+            <w:sz w:val="22"/>
+            <w:szCs w:val="22"/>
+          </w:rPr>
+          <w:t>Google IT Auto</w:t>
+        </w:r>
+        <w:r>
+          <w:rPr>
+            <w:rStyle w:val="Hyperlink"/>
+            <w:rFonts w:ascii="Arial" w:hAnsi="Arial" w:cs="Arial"/>
+            <w:sz w:val="22"/>
+            <w:szCs w:val="22"/>
+          </w:rPr>
+          <w:t>m</w:t>
+        </w:r>
+        <w:r>
+          <w:rPr>
+            <w:rStyle w:val="Hyperlink"/>
+            <w:rFonts w:ascii="Arial" w:hAnsi="Arial" w:cs="Arial"/>
+            <w:sz w:val="22"/>
+            <w:szCs w:val="22"/>
+          </w:rPr>
+          <w:t>ation</w:t>
+        </w:r>
+      </w:hyperlink>
+      <w:r>
+        <w:rPr>
+          <w:rFonts w:ascii="Arial" w:hAnsi="Arial" w:cs="Arial"/>
+          <w:sz w:val="22"/>
+          <w:szCs w:val="22"/>
+        </w:rPr>
+        <w:t xml:space="preserve"> with Python Professional Certificate - Google, 2020</w:t>
+      </w:r>
+    </w:p>
+    <w:p ns2:paraId="1C4D1AD3" ns2:textId="5D28B3F3">
+      <w:pPr>
+        <w:spacing w:after="50" w:line="240" w:lineRule="auto"/>
+        <w:ind w:left="180" w:hanging="180"/>
+        <w:rPr>
+          <w:rFonts w:ascii="Arial" w:hAnsi="Arial" w:cs="Arial"/>
+          <w:sz w:val="22"/>
+          <w:szCs w:val="22"/>
+        </w:rPr>
+      </w:pPr>
+      <w:r>
+        <w:rPr>
+          <w:rFonts w:ascii="Arial" w:hAnsi="Arial" w:cs="Arial"/>
+          <w:sz w:val="22"/>
+          <w:szCs w:val="22"/>
+        </w:rPr>
+        <w:t xml:space="preserve">• </w:t>
+      </w:r>
       <w:hyperlink r:id="rId38" w:history="1">
         <w:r>
           <w:rPr>
@@ -3322,7 +3378,7 @@
         <w:t>: Azure Fundamentals (AZ-900) - Microsoft, 2020</w:t>
       </w:r>
     </w:p>
-    <w:p>
+    <w:p ns2:paraId="194C7514" ns2:textId="1C36E1FC">
       <w:pPr>
         <w:spacing w:after="50" w:line="240" w:lineRule="auto"/>
         <w:ind w:left="180" w:hanging="180"/>
@@ -3340,6 +3396,120 @@
         </w:rPr>
         <w:t xml:space="preserve">• </w:t>
       </w:r>
+      <w:hyperlink r:id="rId40" w:history="1">
+        <w:r>
+          <w:rPr>
+            <w:rStyle w:val="Hyperlink"/>
+            <w:rFonts w:ascii="Arial" w:hAnsi="Arial" w:cs="Arial"/>
+            <w:sz w:val="22"/>
+            <w:szCs w:val="22"/>
+          </w:rPr>
+          <w:t>Data Science Specialization</w:t>
+        </w:r>
+      </w:hyperlink>
+      <w:r>
+        <w:rPr>
+          <w:rFonts w:ascii="Arial" w:hAnsi="Arial" w:cs="Arial"/>
+          <w:sz w:val="22"/>
+          <w:szCs w:val="22"/>
+        </w:rPr>
+        <w:t xml:space="preserve"> - Johns Hopkins University (Coursera), 2020</w:t>
+      </w:r>
+    </w:p>
+    <w:p ns2:paraId="5DC61C4C" ns2:textId="564BA67C">
+      <w:pPr>
+        <w:spacing w:after="50" w:line="240" w:lineRule="auto"/>
+        <w:ind w:left="180" w:hanging="180"/>
+        <w:rPr>
+          <w:rFonts w:ascii="Arial" w:hAnsi="Arial" w:cs="Arial"/>
+          <w:sz w:val="22"/>
+          <w:szCs w:val="22"/>
+        </w:rPr>
+      </w:pPr>
+      <w:r>
+        <w:rPr>
+          <w:rFonts w:ascii="Arial" w:hAnsi="Arial" w:cs="Arial"/>
+          <w:sz w:val="22"/>
+          <w:szCs w:val="22"/>
+        </w:rPr>
+        <w:t xml:space="preserve">• </w:t>
+      </w:r>
+      <w:hyperlink r:id="rId42" w:history="1">
+        <w:r>
+          <w:rPr>
+            <w:rStyle w:val="Hyperlink"/>
+            <w:rFonts w:ascii="Arial" w:hAnsi="Arial" w:cs="Arial"/>
+            <w:sz w:val="22"/>
+            <w:szCs w:val="22"/>
+          </w:rPr>
+          <w:t>DeepLearning.AI TensorFlow Developer</w:t>
+        </w:r>
+      </w:hyperlink>
+      <w:r>
+        <w:rPr>
+          <w:rFonts w:ascii="Arial" w:hAnsi="Arial" w:cs="Arial"/>
+          <w:sz w:val="22"/>
+          <w:szCs w:val="22"/>
+        </w:rPr>
+        <w:t xml:space="preserve"> Professional Certificate - DeepLearning.AI, 2020</w:t>
+      </w:r>
+    </w:p>
+    <w:p ns2:paraId="1506E923" ns2:textId="7C0BBEAF">
+      <w:pPr>
+        <w:spacing w:after="50" w:line="240" w:lineRule="auto"/>
+        <w:ind w:left="180" w:hanging="180"/>
+        <w:rPr>
+          <w:rFonts w:ascii="Arial" w:hAnsi="Arial" w:cs="Arial"/>
+          <w:sz w:val="22"/>
+          <w:szCs w:val="22"/>
+        </w:rPr>
+      </w:pPr>
+      <w:r>
+        <w:rPr>
+          <w:rFonts w:ascii="Arial" w:hAnsi="Arial" w:cs="Arial"/>
+          <w:sz w:val="22"/>
+          <w:szCs w:val="22"/>
+        </w:rPr>
+        <w:t xml:space="preserve">• </w:t>
+      </w:r>
+      <w:hyperlink r:id="rId46" w:history="1">
+        <w:r>
+          <w:rPr>
+            <w:rStyle w:val="Hyperlink"/>
+            <w:rFonts w:ascii="Arial" w:hAnsi="Arial" w:cs="Arial"/>
+            <w:sz w:val="22"/>
+            <w:szCs w:val="22"/>
+          </w:rPr>
+          <w:t>Google IT Support</w:t>
+        </w:r>
+      </w:hyperlink>
+      <w:r>
+        <w:rPr>
+          <w:rFonts w:ascii="Arial" w:hAnsi="Arial" w:cs="Arial"/>
+          <w:sz w:val="22"/>
+          <w:szCs w:val="22"/>
+        </w:rPr>
+        <w:t xml:space="preserve"> Professional Certificate - Google, 2020</w:t>
+      </w:r>
+    </w:p>
+    <w:p ns2:paraId="550AC5A0" ns2:textId="62B883C0">
+      <w:pPr>
+        <w:spacing w:after="50" w:line="240" w:lineRule="auto"/>
+        <w:ind w:left="180" w:hanging="180"/>
+        <w:rPr>
+          <w:rFonts w:ascii="Arial" w:hAnsi="Arial" w:cs="Arial"/>
+          <w:sz w:val="22"/>
+          <w:szCs w:val="22"/>
+        </w:rPr>
+      </w:pPr>
+      <w:r>
+        <w:rPr>
+          <w:rFonts w:ascii="Arial" w:hAnsi="Arial" w:cs="Arial"/>
+          <w:sz w:val="22"/>
+          <w:szCs w:val="22"/>
+        </w:rPr>
+        <w:t xml:space="preserve">• </w:t>
+      </w:r>
       <w:hyperlink r:id="rId39" w:history="1">
         <w:r>
           <w:rPr>
@@ -3360,7 +3530,7 @@
         <w:t xml:space="preserve"> Specialization - Amazon Web Services (Coursera), 2020</w:t>
       </w:r>
     </w:p>
-    <w:p>
+    <w:p ns2:paraId="25342D99" ns2:textId="199B4F74">
       <w:pPr>
         <w:spacing w:after="50" w:line="240" w:lineRule="auto"/>
         <w:ind w:left="180" w:hanging="180"/>
@@ -3378,7 +3548,7 @@
         </w:rPr>
         <w:t xml:space="preserve">• </w:t>
       </w:r>
-      <w:hyperlink r:id="rId40" w:history="1">
+      <w:hyperlink r:id="rId41" w:history="1">
         <w:r>
           <w:rPr>
             <w:rStyle w:val="Hyperlink"/>
@@ -3386,7 +3556,7 @@
             <w:sz w:val="22"/>
             <w:szCs w:val="22"/>
           </w:rPr>
-          <w:t>Data Science Specialization</w:t>
+          <w:t>Six Sigma Green Belt</w:t>
         </w:r>
       </w:hyperlink>
       <w:r>
@@ -3395,86 +3565,10 @@
           <w:sz w:val="22"/>
           <w:szCs w:val="22"/>
         </w:rPr>
-        <w:t xml:space="preserve"> - Johns Hopkins University (Coursera), 2020</w:t>
-      </w:r>
-    </w:p>
-    <w:p>
-      <w:pPr>
-        <w:spacing w:after="50" w:line="240" w:lineRule="auto"/>
-        <w:ind w:left="180" w:hanging="180"/>
-        <w:rPr>
-          <w:rFonts w:ascii="Arial" w:hAnsi="Arial" w:cs="Arial"/>
-          <w:sz w:val="22"/>
-          <w:szCs w:val="22"/>
-        </w:rPr>
-      </w:pPr>
-      <w:r>
-        <w:rPr>
-          <w:rFonts w:ascii="Arial" w:hAnsi="Arial" w:cs="Arial"/>
-          <w:sz w:val="22"/>
-          <w:szCs w:val="22"/>
-        </w:rPr>
-        <w:t xml:space="preserve">• </w:t>
-      </w:r>
-      <w:hyperlink r:id="rId41" w:history="1">
-        <w:r>
-          <w:rPr>
-            <w:rStyle w:val="Hyperlink"/>
-            <w:rFonts w:ascii="Arial" w:hAnsi="Arial" w:cs="Arial"/>
-            <w:sz w:val="22"/>
-            <w:szCs w:val="22"/>
-          </w:rPr>
-          <w:t>Six Sigma Green Belt</w:t>
-        </w:r>
-      </w:hyperlink>
-      <w:r>
-        <w:rPr>
-          <w:rFonts w:ascii="Arial" w:hAnsi="Arial" w:cs="Arial"/>
-          <w:sz w:val="22"/>
-          <w:szCs w:val="22"/>
-        </w:rPr>
         <w:t xml:space="preserve"> - Kennesaw State University (Coursera), 2020</w:t>
       </w:r>
     </w:p>
-    <w:p>
-      <w:pPr>
-        <w:spacing w:after="50" w:line="240" w:lineRule="auto"/>
-        <w:ind w:left="180" w:hanging="180"/>
-        <w:rPr>
-          <w:rFonts w:ascii="Arial" w:hAnsi="Arial" w:cs="Arial"/>
-          <w:sz w:val="22"/>
-          <w:szCs w:val="22"/>
-        </w:rPr>
-      </w:pPr>
-      <w:r>
-        <w:rPr>
-          <w:rFonts w:ascii="Arial" w:hAnsi="Arial" w:cs="Arial"/>
-          <w:sz w:val="22"/>
-          <w:szCs w:val="22"/>
-        </w:rPr>
-        <w:t xml:space="preserve">• </w:t>
-      </w:r>
-      <w:hyperlink r:id="rId42" w:history="1">
-        <w:r>
-          <w:rPr>
-            <w:rStyle w:val="Hyperlink"/>
-            <w:rFonts w:ascii="Arial" w:hAnsi="Arial" w:cs="Arial"/>
-            <w:sz w:val="22"/>
-            <w:szCs w:val="22"/>
-          </w:rPr>
-          <w:t>DeepLearning.AI TensorFlow Developer</w:t>
-        </w:r>
-      </w:hyperlink>
-      <w:r>
-        <w:rPr>
-          <w:rFonts w:ascii="Arial" w:hAnsi="Arial" w:cs="Arial"/>
-          <w:sz w:val="22"/>
-          <w:szCs w:val="22"/>
-        </w:rPr>
-        <w:t xml:space="preserve"> Professional Certificate - DeepLearning.AI, 2020</w:t>
-      </w:r>
-    </w:p>
-    <w:p>
+    <w:p ns2:paraId="14388806" ns2:textId="479C8845">
       <w:pPr>
         <w:spacing w:after="50" w:line="240" w:lineRule="auto"/>
         <w:ind w:left="180" w:hanging="180"/>
@@ -3513,7 +3607,7 @@
         <w:t xml:space="preserve"> - DeepLearning.AI, 2020</w:t>
       </w:r>
     </w:p>
-    <w:p>
+    <w:p ns2:paraId="57C6FDAF" ns2:textId="6C75C962">
       <w:pPr>
         <w:spacing w:after="50" w:line="240" w:lineRule="auto"/>
         <w:ind w:left="180" w:hanging="180"/>
@@ -3551,7 +3645,7 @@
         <w:t xml:space="preserve"> Professional Certificate - IBM, 2020</w:t>
       </w:r>
     </w:p>
-    <w:p>
+    <w:p ns2:paraId="214B3C29" ns2:textId="4ECE0F0C">
       <w:pPr>
         <w:spacing w:after="50" w:line="240" w:lineRule="auto"/>
         <w:ind w:left="180" w:hanging="180"/>
@@ -3569,7 +3663,7 @@
         </w:rPr>
         <w:t xml:space="preserve">• </w:t>
       </w:r>
-      <w:hyperlink r:id="rId45" w:history="1">
+      <w:hyperlink r:id="rId47" w:history="1">
         <w:r>
           <w:rPr>
             <w:rStyle w:val="Hyperlink"/>
@@ -3577,25 +3671,7 @@
             <w:sz w:val="22"/>
             <w:szCs w:val="22"/>
           </w:rPr>
-          <w:t>Google IT Auto</w:t>
-        </w:r>
-        <w:r>
-          <w:rPr>
-            <w:rStyle w:val="Hyperlink"/>
-            <w:rFonts w:ascii="Arial" w:hAnsi="Arial" w:cs="Arial"/>
-            <w:sz w:val="22"/>
-            <w:szCs w:val="22"/>
-          </w:rPr>
-          <w:t>m</w:t>
-        </w:r>
-        <w:r>
-          <w:rPr>
-            <w:rStyle w:val="Hyperlink"/>
-            <w:rFonts w:ascii="Arial" w:hAnsi="Arial" w:cs="Arial"/>
-            <w:sz w:val="22"/>
-            <w:szCs w:val="22"/>
-          </w:rPr>
-          <w:t>ation</w:t>
+          <w:t>Blockchain Specialization</w:t>
         </w:r>
       </w:hyperlink>
       <w:r>
@@ -3604,86 +3680,10 @@
           <w:sz w:val="22"/>
           <w:szCs w:val="22"/>
         </w:rPr>
-        <w:t xml:space="preserve"> with Python Professional Certificate - Google, 2020</w:t>
-      </w:r>
-    </w:p>
-    <w:p>
-      <w:pPr>
-        <w:spacing w:after="50" w:line="240" w:lineRule="auto"/>
-        <w:ind w:left="180" w:hanging="180"/>
-        <w:rPr>
-          <w:rFonts w:ascii="Arial" w:hAnsi="Arial" w:cs="Arial"/>
-          <w:sz w:val="22"/>
-          <w:szCs w:val="22"/>
-        </w:rPr>
-      </w:pPr>
-      <w:r>
-        <w:rPr>
-          <w:rFonts w:ascii="Arial" w:hAnsi="Arial" w:cs="Arial"/>
-          <w:sz w:val="22"/>
-          <w:szCs w:val="22"/>
-        </w:rPr>
-        <w:t xml:space="preserve">• </w:t>
-      </w:r>
-      <w:hyperlink r:id="rId46" w:history="1">
-        <w:r>
-          <w:rPr>
-            <w:rStyle w:val="Hyperlink"/>
-            <w:rFonts w:ascii="Arial" w:hAnsi="Arial" w:cs="Arial"/>
-            <w:sz w:val="22"/>
-            <w:szCs w:val="22"/>
-          </w:rPr>
-          <w:t>Google IT Support</w:t>
-        </w:r>
-      </w:hyperlink>
-      <w:r>
-        <w:rPr>
-          <w:rFonts w:ascii="Arial" w:hAnsi="Arial" w:cs="Arial"/>
-          <w:sz w:val="22"/>
-          <w:szCs w:val="22"/>
-        </w:rPr>
-        <w:t xml:space="preserve"> Professional Certificate - Google, 2020</w:t>
-      </w:r>
-    </w:p>
-    <w:p>
-      <w:pPr>
-        <w:spacing w:after="50" w:line="240" w:lineRule="auto"/>
-        <w:ind w:left="180" w:hanging="180"/>
-        <w:rPr>
-          <w:rFonts w:ascii="Arial" w:hAnsi="Arial" w:cs="Arial"/>
-          <w:sz w:val="22"/>
-          <w:szCs w:val="22"/>
-        </w:rPr>
-      </w:pPr>
-      <w:r>
-        <w:rPr>
-          <w:rFonts w:ascii="Arial" w:hAnsi="Arial" w:cs="Arial"/>
-          <w:sz w:val="22"/>
-          <w:szCs w:val="22"/>
-        </w:rPr>
-        <w:t xml:space="preserve">• </w:t>
-      </w:r>
-      <w:hyperlink r:id="rId47" w:history="1">
-        <w:r>
-          <w:rPr>
-            <w:rStyle w:val="Hyperlink"/>
-            <w:rFonts w:ascii="Arial" w:hAnsi="Arial" w:cs="Arial"/>
-            <w:sz w:val="22"/>
-            <w:szCs w:val="22"/>
-          </w:rPr>
-          <w:t>Blockchain Specialization</w:t>
-        </w:r>
-      </w:hyperlink>
-      <w:r>
-        <w:rPr>
-          <w:rFonts w:ascii="Arial" w:hAnsi="Arial" w:cs="Arial"/>
-          <w:sz w:val="22"/>
-          <w:szCs w:val="22"/>
-        </w:rPr>
         <w:t xml:space="preserve"> - University of California, Irvine (Coursera), 2020</w:t>
       </w:r>
     </w:p>
-    <w:p>
+    <w:p ns2:paraId="452AAA4C" ns2:textId="5E29ABD1">
       <w:pPr>
         <w:pBdr>
           <w:bottom w:val="single" w:sz="6" w:space="1" w:color="666666"/>
@@ -3708,7 +3708,7 @@
         <w:t>ducation</w:t>
       </w:r>
     </w:p>
-    <w:p>
+    <w:p ns2:paraId="10D4037F" ns2:textId="5E414CFF">
       <w:pPr>
         <w:spacing w:before="120" w:after="10" w:line="240" w:lineRule="auto"/>
         <w:rPr>
@@ -3772,7 +3772,7 @@
         <w:t>umbai</w:t>
       </w:r>
     </w:p>
-    <w:p>
+    <w:p ns2:paraId="3096E978" ns2:textId="77777777">
       <w:pPr>
         <w:spacing w:after="60" w:line="240" w:lineRule="auto"/>
         <w:rPr>
@@ -3790,7 +3790,7 @@
         <w:t>Bachelor of Engineering (B.E.), Chemical Engineering (First Class)</w:t>
       </w:r>
     </w:p>
-    <w:p>
+    <w:p ns2:paraId="28875B44" ns2:textId="0B64B7B7">
       <w:pPr>
         <w:spacing w:after="60" w:line="240" w:lineRule="auto"/>
         <w:rPr>

</xml_diff>

<commit_message>
docs: repair Devayan_Mandal.docx (byte-level cert edit, Word-safe)
</commit_message>
<xml_diff>
--- a/docs/Devayan_Mandal.docx
+++ b/docs/Devayan_Mandal.docx
@@ -1,8 +1,8 @@
 
 <file path=word/document.xml><?xml version="1.0" encoding="utf-8"?>
-<w:document xmlns:mc="http://schemas.openxmlformats.org/markup-compatibility/2006" xmlns:ns2="http://schemas.microsoft.com/office/word/2010/wordml" xmlns:r="http://schemas.openxmlformats.org/officeDocument/2006/relationships" xmlns:w="http://schemas.openxmlformats.org/wordprocessingml/2006/main" mc:Ignorable="w14 w15 w16se w16cid w16 w16cex w16sdtdh w16sdtfl w16du wp14">
+<w:document xmlns:wpc="http://schemas.microsoft.com/office/word/2010/wordprocessingCanvas" xmlns:cx="http://schemas.microsoft.com/office/drawing/2014/chartex" xmlns:cx1="http://schemas.microsoft.com/office/drawing/2015/9/8/chartex" xmlns:cx2="http://schemas.microsoft.com/office/drawing/2015/10/21/chartex" xmlns:cx3="http://schemas.microsoft.com/office/drawing/2016/5/9/chartex" xmlns:cx4="http://schemas.microsoft.com/office/drawing/2016/5/10/chartex" xmlns:cx5="http://schemas.microsoft.com/office/drawing/2016/5/11/chartex" xmlns:cx6="http://schemas.microsoft.com/office/drawing/2016/5/12/chartex" xmlns:cx7="http://schemas.microsoft.com/office/drawing/2016/5/13/chartex" xmlns:cx8="http://schemas.microsoft.com/office/drawing/2016/5/14/chartex" xmlns:mc="http://schemas.openxmlformats.org/markup-compatibility/2006" xmlns:aink="http://schemas.microsoft.com/office/drawing/2016/ink" xmlns:am3d="http://schemas.microsoft.com/office/drawing/2017/model3d" xmlns:o="urn:schemas-microsoft-com:office:office" xmlns:oel="http://schemas.microsoft.com/office/2019/extlst" xmlns:r="http://schemas.openxmlformats.org/officeDocument/2006/relationships" xmlns:m="http://schemas.openxmlformats.org/officeDocument/2006/math" xmlns:v="urn:schemas-microsoft-com:vml" xmlns:wp14="http://schemas.microsoft.com/office/word/2010/wordprocessingDrawing" xmlns:wp="http://schemas.openxmlformats.org/drawingml/2006/wordprocessingDrawing" xmlns:w10="urn:schemas-microsoft-com:office:word" xmlns:w="http://schemas.openxmlformats.org/wordprocessingml/2006/main" xmlns:w14="http://schemas.microsoft.com/office/word/2010/wordml" xmlns:w15="http://schemas.microsoft.com/office/word/2012/wordml" xmlns:w16cex="http://schemas.microsoft.com/office/word/2018/wordml/cex" xmlns:w16cid="http://schemas.microsoft.com/office/word/2016/wordml/cid" xmlns:w16="http://schemas.microsoft.com/office/word/2018/wordml" xmlns:w16du="http://schemas.microsoft.com/office/word/2023/wordml/word16du" xmlns:w16sdtdh="http://schemas.microsoft.com/office/word/2020/wordml/sdtdatahash" xmlns:w16sdtfl="http://schemas.microsoft.com/office/word/2024/wordml/sdtformatlock" xmlns:w16se="http://schemas.microsoft.com/office/word/2015/wordml/symex" xmlns:wpg="http://schemas.microsoft.com/office/word/2010/wordprocessingGroup" xmlns:wpi="http://schemas.microsoft.com/office/word/2010/wordprocessingInk" xmlns:wne="http://schemas.microsoft.com/office/word/2006/wordml" xmlns:wps="http://schemas.microsoft.com/office/word/2010/wordprocessingShape" mc:Ignorable="w14 w15 w16se w16cid w16 w16cex w16sdtdh w16sdtfl w16du wp14">
   <w:body>
-    <w:p ns2:paraId="2EA2A59B" ns2:textId="13E5B618">
+    <w:p>
       <w:pPr>
         <w:spacing w:after="40" w:line="240" w:lineRule="auto"/>
         <w:jc w:val="center"/>
@@ -49,7 +49,7 @@
         <w:t>andal</w:t>
       </w:r>
     </w:p>
-    <w:p ns2:paraId="30B7F3EA" ns2:textId="77777777">
+    <w:p>
       <w:pPr>
         <w:spacing w:after="40" w:line="240" w:lineRule="auto"/>
         <w:jc w:val="center"/>
@@ -64,7 +64,7 @@
         <w:t>Full Stack AI Native / Forward Deployed AI Engineer &amp; Open-Source Contributor - Open to Remote Work</w:t>
       </w:r>
     </w:p>
-    <w:p ns2:paraId="1C153239" ns2:textId="77777777">
+    <w:p>
       <w:pPr>
         <w:spacing w:after="200" w:line="240" w:lineRule="auto"/>
         <w:jc w:val="center"/>
@@ -125,7 +125,7 @@
         <w:proofErr w:type="spellEnd"/>
       </w:hyperlink>
     </w:p>
-    <w:p ns2:paraId="743482DB" ns2:textId="343F6123">
+    <w:p>
       <w:pPr>
         <w:pBdr>
           <w:bottom w:val="single" w:sz="6" w:space="1" w:color="666666"/>
@@ -164,7 +164,7 @@
         <w:t>ummary</w:t>
       </w:r>
     </w:p>
-    <w:p ns2:paraId="1D8CF6B5" ns2:textId="77777777">
+    <w:p>
       <w:pPr>
         <w:spacing w:after="60" w:line="240" w:lineRule="auto"/>
         <w:rPr>
@@ -200,7 +200,7 @@
         <w:t xml:space="preserve"> infra.</w:t>
       </w:r>
     </w:p>
-    <w:p ns2:paraId="43E14E01" ns2:textId="591BC61E">
+    <w:p>
       <w:pPr>
         <w:spacing w:after="60" w:line="240" w:lineRule="auto"/>
         <w:rPr>
@@ -254,7 +254,7 @@
         <w:t xml:space="preserve"> and others; owned root cause to release.</w:t>
       </w:r>
     </w:p>
-    <w:p ns2:paraId="357A4472" ns2:textId="34676910">
+    <w:p>
       <w:pPr>
         <w:pBdr>
           <w:bottom w:val="single" w:sz="6" w:space="1" w:color="666666"/>
@@ -293,7 +293,7 @@
         <w:t>kills</w:t>
       </w:r>
     </w:p>
-    <w:p ns2:paraId="2EA09937" ns2:textId="77777777">
+    <w:p>
       <w:pPr>
         <w:spacing w:after="50" w:line="240" w:lineRule="auto"/>
         <w:ind w:left="180" w:hanging="180"/>
@@ -312,7 +312,7 @@
         <w:t>• Languages: Python, TypeScript, JavaScript, Rust, SQL, Bash</w:t>
       </w:r>
     </w:p>
-    <w:p ns2:paraId="6222979D" ns2:textId="77777777">
+    <w:p>
       <w:pPr>
         <w:spacing w:after="50" w:line="240" w:lineRule="auto"/>
         <w:ind w:left="180" w:hanging="180"/>
@@ -349,7 +349,7 @@
         <w:t>, Gemini, OpenAI</w:t>
       </w:r>
     </w:p>
-    <w:p ns2:paraId="641F4A8F" ns2:textId="77777777">
+    <w:p>
       <w:pPr>
         <w:spacing w:after="50" w:line="240" w:lineRule="auto"/>
         <w:ind w:left="180" w:hanging="180"/>
@@ -368,7 +368,7 @@
         <w:t>• Frontend: React 19, Next.js 16, TanStack, Tailwind v4, Vite, Expo, Three.js</w:t>
       </w:r>
     </w:p>
-    <w:p ns2:paraId="1F7C38B4" ns2:textId="77777777">
+    <w:p>
       <w:pPr>
         <w:spacing w:after="50" w:line="240" w:lineRule="auto"/>
         <w:ind w:left="180" w:hanging="180"/>
@@ -415,7 +415,7 @@
       </w:r>
       <w:proofErr w:type="spellEnd"/>
     </w:p>
-    <w:p ns2:paraId="7B980251" ns2:textId="77777777">
+    <w:p>
       <w:pPr>
         <w:spacing w:after="50" w:line="240" w:lineRule="auto"/>
         <w:ind w:left="180" w:hanging="180"/>
@@ -480,7 +480,7 @@
       </w:r>
       <w:proofErr w:type="spellEnd"/>
     </w:p>
-    <w:p ns2:paraId="119DCEB8" ns2:textId="77777777">
+    <w:p>
       <w:pPr>
         <w:spacing w:after="50" w:line="240" w:lineRule="auto"/>
         <w:ind w:left="180" w:hanging="180"/>
@@ -535,7 +535,7 @@
         <w:t>, Playwright</w:t>
       </w:r>
     </w:p>
-    <w:p ns2:paraId="6E1034E5" ns2:textId="77777777">
+    <w:p>
       <w:pPr>
         <w:spacing w:after="50" w:line="240" w:lineRule="auto"/>
         <w:ind w:left="180" w:hanging="180"/>
@@ -590,7 +590,7 @@
         <w:t>, Safe, Base L2</w:t>
       </w:r>
     </w:p>
-    <w:p ns2:paraId="7ECA1D0A" ns2:textId="77777777">
+    <w:p>
       <w:pPr>
         <w:spacing w:after="50" w:line="240" w:lineRule="auto"/>
         <w:ind w:left="180" w:hanging="180"/>
@@ -609,7 +609,7 @@
         <w:t>• Practices: Six Sigma, bounded autonomy, cost-aware routing, Git, Changesets</w:t>
       </w:r>
     </w:p>
-    <w:p ns2:paraId="2AC8FF8C" ns2:textId="681C41FB">
+    <w:p>
       <w:pPr>
         <w:pBdr>
           <w:bottom w:val="single" w:sz="6" w:space="1" w:color="666666"/>
@@ -648,7 +648,7 @@
         <w:t>xperience</w:t>
       </w:r>
     </w:p>
-    <w:p ns2:paraId="7C005B86" ns2:textId="4A396FA2">
+    <w:p>
       <w:pPr>
         <w:spacing w:before="120" w:after="10" w:line="240" w:lineRule="auto"/>
         <w:rPr>
@@ -700,7 +700,7 @@
         <w:t>Merged Open-Source Contributions</w:t>
       </w:r>
     </w:p>
-    <w:p ns2:paraId="34C41054" ns2:textId="2490F7D2">
+    <w:p>
       <w:pPr>
         <w:spacing w:after="50" w:line="240" w:lineRule="auto"/>
         <w:ind w:left="180" w:hanging="180"/>
@@ -778,7 +778,7 @@
         <w:t>-traversing rule to nursery; 1,972 lines, 13 packages.</w:t>
       </w:r>
     </w:p>
-    <w:p ns2:paraId="60B328AD" ns2:textId="77777777">
+    <w:p>
       <w:pPr>
         <w:spacing w:after="50" w:line="240" w:lineRule="auto"/>
         <w:ind w:left="180" w:hanging="180"/>
@@ -851,7 +851,7 @@
         <w:t xml:space="preserve"> (Rust/TypeScript) - fixed FreeBSD/Unix startup crash via Unix fallback store path.</w:t>
       </w:r>
     </w:p>
-    <w:p ns2:paraId="542C5D99" ns2:textId="77777777">
+    <w:p>
       <w:pPr>
         <w:spacing w:after="50" w:line="240" w:lineRule="auto"/>
         <w:ind w:left="180" w:hanging="180"/>
@@ -942,7 +942,7 @@
         <w:t>() setting _ending flag and hiding socket errors.</w:t>
       </w:r>
     </w:p>
-    <w:p ns2:paraId="450F8DE0" ns2:textId="77777777">
+    <w:p>
       <w:pPr>
         <w:spacing w:after="50" w:line="240" w:lineRule="auto"/>
         <w:ind w:left="180" w:hanging="180"/>
@@ -999,7 +999,7 @@
         <w:t xml:space="preserve"> from portal SVG groups to stop false focus rings; added test.</w:t>
       </w:r>
     </w:p>
-    <w:p ns2:paraId="00C2954F" ns2:textId="77777777">
+    <w:p>
       <w:pPr>
         <w:spacing w:after="50" w:line="240" w:lineRule="auto"/>
         <w:ind w:left="180" w:hanging="180"/>
@@ -1060,7 +1060,7 @@
         <w:t xml:space="preserve"> (Rust) - fixed Windows interpreter crash on non-UTF-8 output via from_utf8_lossy; added decode test.</w:t>
       </w:r>
     </w:p>
-    <w:p ns2:paraId="43E69D63" ns2:textId="77777777">
+    <w:p>
       <w:pPr>
         <w:spacing w:after="50" w:line="240" w:lineRule="auto"/>
         <w:ind w:left="180" w:hanging="180"/>
@@ -1169,7 +1169,7 @@
         <w:t xml:space="preserve"> race.</w:t>
       </w:r>
     </w:p>
-    <w:p ns2:paraId="0130C6D2" ns2:textId="77777777">
+    <w:p>
       <w:pPr>
         <w:spacing w:after="50" w:line="240" w:lineRule="auto"/>
         <w:ind w:left="180" w:hanging="180"/>
@@ -1262,7 +1262,7 @@
         <w:t xml:space="preserve"> during auto package-manager switch.</w:t>
       </w:r>
     </w:p>
-    <w:p ns2:paraId="47481BCA" ns2:textId="77777777">
+    <w:p>
       <w:pPr>
         <w:spacing w:after="50" w:line="240" w:lineRule="auto"/>
         <w:ind w:left="180" w:hanging="180"/>
@@ -1319,7 +1319,7 @@
         <w:t xml:space="preserve"> regression test for phone verify body; tests only.</w:t>
       </w:r>
     </w:p>
-    <w:p ns2:paraId="345EE263" ns2:textId="77777777">
+    <w:p>
       <w:pPr>
         <w:spacing w:after="50" w:line="240" w:lineRule="auto"/>
         <w:ind w:left="180" w:hanging="180"/>
@@ -1410,7 +1410,7 @@
         <w:t xml:space="preserve"> to rethrow 401/429/timeout instead of false unsupported.</w:t>
       </w:r>
     </w:p>
-    <w:p ns2:paraId="371FB247" ns2:textId="77777777">
+    <w:p>
       <w:pPr>
         <w:spacing w:after="50" w:line="240" w:lineRule="auto"/>
         <w:ind w:left="180" w:hanging="180"/>
@@ -1479,7 +1479,7 @@
         <w:t xml:space="preserve"> guide.</w:t>
       </w:r>
     </w:p>
-    <w:p ns2:paraId="56071E1D" ns2:textId="77777777">
+    <w:p>
       <w:pPr>
         <w:spacing w:after="50" w:line="240" w:lineRule="auto"/>
         <w:ind w:left="180" w:hanging="180"/>
@@ -1558,7 +1558,7 @@
         <w:t xml:space="preserve"> indexing before init.</w:t>
       </w:r>
     </w:p>
-    <w:p ns2:paraId="6A1B33F2" ns2:textId="77777777">
+    <w:p>
       <w:pPr>
         <w:spacing w:after="50" w:line="240" w:lineRule="auto"/>
         <w:ind w:left="180" w:hanging="180"/>
@@ -1667,7 +1667,7 @@
         <w:t>: prefixes during update.</w:t>
       </w:r>
     </w:p>
-    <w:p ns2:paraId="30A4BCF5" ns2:textId="77777777">
+    <w:p>
       <w:pPr>
         <w:spacing w:after="50" w:line="240" w:lineRule="auto"/>
         <w:ind w:left="180" w:hanging="180"/>
@@ -1778,7 +1778,7 @@
         <w:t>] env table.</w:t>
       </w:r>
     </w:p>
-    <w:p ns2:paraId="3AF1C803" ns2:textId="77777777">
+    <w:p>
       <w:pPr>
         <w:spacing w:after="50" w:line="240" w:lineRule="auto"/>
         <w:ind w:left="180" w:hanging="180"/>
@@ -1835,7 +1835,7 @@
         <w:t xml:space="preserve"> endpoint.</w:t>
       </w:r>
     </w:p>
-    <w:p ns2:paraId="68930017" ns2:textId="77777777">
+    <w:p>
       <w:pPr>
         <w:spacing w:after="50" w:line="240" w:lineRule="auto"/>
         <w:ind w:left="180" w:hanging="180"/>
@@ -1896,7 +1896,7 @@
         <w:t xml:space="preserve"> (Python) - added configurable comment-verbosity check on added lines only.</w:t>
       </w:r>
     </w:p>
-    <w:p ns2:paraId="6A776CDC" ns2:textId="77777777">
+    <w:p>
       <w:pPr>
         <w:spacing w:after="50" w:line="240" w:lineRule="auto"/>
         <w:ind w:left="180" w:hanging="180"/>
@@ -1935,7 +1935,7 @@
         <w:t xml:space="preserve"> (MDX) - fixed address example to propagate Result instead of unwrapping bad XDR.</w:t>
       </w:r>
     </w:p>
-    <w:p ns2:paraId="02983374" ns2:textId="77777777">
+    <w:p>
       <w:pPr>
         <w:spacing w:after="50" w:line="240" w:lineRule="auto"/>
         <w:ind w:left="180" w:hanging="180"/>
@@ -1996,7 +1996,7 @@
         <w:t xml:space="preserve"> (Python) - aligned DESIGN.md 10.14 Hunk entry.</w:t>
       </w:r>
     </w:p>
-    <w:p ns2:paraId="23FAA276" ns2:textId="77777777">
+    <w:p>
       <w:pPr>
         <w:spacing w:after="50" w:line="240" w:lineRule="auto"/>
         <w:ind w:left="180" w:hanging="180"/>
@@ -2079,7 +2079,7 @@
         <w:t xml:space="preserve"> (TypeScript) - extended docs pipeline to migration pages: Starlight sidebar.</w:t>
       </w:r>
     </w:p>
-    <w:p ns2:paraId="613760FC" ns2:textId="62F471E9">
+    <w:p>
       <w:pPr>
         <w:spacing w:after="50" w:line="240" w:lineRule="auto"/>
         <w:ind w:left="180" w:hanging="180"/>
@@ -2149,7 +2149,7 @@
         <w:t xml:space="preserve"> at EOF so output stays valid TOML.</w:t>
       </w:r>
     </w:p>
-    <w:p ns2:paraId="24908568" ns2:textId="77777777">
+    <w:p>
       <w:pPr>
         <w:spacing w:after="50" w:line="240" w:lineRule="auto"/>
         <w:ind w:left="180" w:hanging="180"/>
@@ -2200,7 +2200,7 @@
         <w:t xml:space="preserve"> (Rust) - fixed insert offset to full-manifest coordinates.</w:t>
       </w:r>
     </w:p>
-    <w:p ns2:paraId="575AA2CC" ns2:textId="77777777">
+    <w:p>
       <w:pPr>
         <w:spacing w:after="50" w:line="240" w:lineRule="auto"/>
         <w:ind w:left="180" w:hanging="180"/>
@@ -2299,7 +2299,7 @@
         <w:t xml:space="preserve"> checks.</w:t>
       </w:r>
     </w:p>
-    <w:p ns2:paraId="4B2458E8" ns2:textId="77777777">
+    <w:p>
       <w:pPr>
         <w:spacing w:after="50" w:line="240" w:lineRule="auto"/>
         <w:ind w:left="180" w:hanging="180"/>
@@ -2372,7 +2372,7 @@
         <w:t xml:space="preserve"> (Rust) - fixed --no-bail pattern runs to continue and aggregate failures.</w:t>
       </w:r>
     </w:p>
-    <w:p ns2:paraId="4C738C3B" ns2:textId="77777777">
+    <w:p>
       <w:pPr>
         <w:spacing w:after="50" w:line="240" w:lineRule="auto"/>
         <w:ind w:left="180" w:hanging="180"/>
@@ -2411,7 +2411,7 @@
         <w:t xml:space="preserve"> (MDX) - added missing --enable-core-manual-close flag to Network Modes Local section.</w:t>
       </w:r>
     </w:p>
-    <w:p ns2:paraId="07D78602" ns2:textId="77777777">
+    <w:p>
       <w:pPr>
         <w:spacing w:after="50" w:line="240" w:lineRule="auto"/>
         <w:ind w:left="180" w:hanging="180"/>
@@ -2492,7 +2492,7 @@
         <w:t xml:space="preserve"> so pipes/HTML cannot break summary tables.</w:t>
       </w:r>
     </w:p>
-    <w:p ns2:paraId="723CB4A5" ns2:textId="77777777">
+    <w:p>
       <w:pPr>
         <w:spacing w:after="50" w:line="240" w:lineRule="auto"/>
         <w:ind w:left="180" w:hanging="180"/>
@@ -2549,7 +2549,7 @@
         <w:t xml:space="preserve"> preferred.</w:t>
       </w:r>
     </w:p>
-    <w:p ns2:paraId="1DEB0771" ns2:textId="77777777">
+    <w:p>
       <w:pPr>
         <w:spacing w:after="50" w:line="240" w:lineRule="auto"/>
         <w:ind w:left="180" w:hanging="180"/>
@@ -2606,7 +2606,7 @@
         <w:t xml:space="preserve"> no TLS needed for Freighter.</w:t>
       </w:r>
     </w:p>
-    <w:p ns2:paraId="7C5773DA" ns2:textId="77777777">
+    <w:p>
       <w:pPr>
         <w:spacing w:after="60" w:line="240" w:lineRule="auto"/>
         <w:rPr>
@@ -2617,7 +2617,7 @@
         </w:rPr>
       </w:pPr>
     </w:p>
-    <w:p ns2:paraId="19F4340E" ns2:textId="4617063F">
+    <w:p>
       <w:pPr>
         <w:spacing w:after="60" w:line="240" w:lineRule="auto"/>
         <w:rPr>
@@ -2632,7 +2632,7 @@
         <w:t>Full Stack AI Native / Forward Deployed AI Engineer | June 2026 - Present | Remote</w:t>
       </w:r>
     </w:p>
-    <w:p ns2:paraId="487DCCE2" ns2:textId="77777777">
+    <w:p>
       <w:pPr>
         <w:spacing w:after="50" w:line="240" w:lineRule="auto"/>
         <w:ind w:left="180" w:hanging="180"/>
@@ -2669,7 +2669,7 @@
         <w:t xml:space="preserve"> observability, and web apps.</w:t>
       </w:r>
     </w:p>
-    <w:p ns2:paraId="1D29E51A" ns2:textId="77777777">
+    <w:p>
       <w:pPr>
         <w:spacing w:after="50" w:line="240" w:lineRule="auto"/>
         <w:ind w:left="180" w:hanging="180"/>
@@ -2706,7 +2706,7 @@
         <w:t xml:space="preserve"> evals, SSE dashboard.</w:t>
       </w:r>
     </w:p>
-    <w:p ns2:paraId="6B46D89B" ns2:textId="77777777">
+    <w:p>
       <w:pPr>
         <w:spacing w:after="50" w:line="240" w:lineRule="auto"/>
         <w:ind w:left="180" w:hanging="180"/>
@@ -2743,7 +2743,7 @@
         <w:t xml:space="preserve"> traces).</w:t>
       </w:r>
     </w:p>
-    <w:p ns2:paraId="17F09B10" ns2:textId="77777777">
+    <w:p>
       <w:pPr>
         <w:spacing w:after="50" w:line="240" w:lineRule="auto"/>
         <w:ind w:left="180" w:hanging="180"/>
@@ -2780,7 +2780,7 @@
         <w:t xml:space="preserve"> (calendar-math, meeting-slot, unit-fix): sweep-line solvers, sandboxed graders, no LLM judge.</w:t>
       </w:r>
     </w:p>
-    <w:p ns2:paraId="047965E5" ns2:textId="77777777">
+    <w:p>
       <w:pPr>
         <w:spacing w:after="50" w:line="240" w:lineRule="auto"/>
         <w:ind w:left="180" w:hanging="180"/>
@@ -2871,7 +2871,7 @@
         <w:t xml:space="preserve"> Challenge 2026).</w:t>
       </w:r>
     </w:p>
-    <w:p ns2:paraId="4046B4B2" ns2:textId="77777777">
+    <w:p>
       <w:pPr>
         <w:spacing w:after="50" w:line="240" w:lineRule="auto"/>
         <w:ind w:left="180" w:hanging="180"/>
@@ -2908,7 +2908,7 @@
         <w:t>: 5,000+ open roles across Greenhouse/Ashby/Lever; TanStack Start, React 19, Neon Postgres, Expo, 4x-daily crawls. Live: jobrow.vercel.app</w:t>
       </w:r>
     </w:p>
-    <w:p ns2:paraId="738ED479" ns2:textId="16258D27">
+    <w:p>
       <w:pPr>
         <w:spacing w:after="50" w:line="240" w:lineRule="auto"/>
         <w:ind w:left="180" w:hanging="180"/>
@@ -2927,7 +2927,7 @@
         <w:t>• Veritas (research agent), Cadence (healthcare, 5-layer memory), chaos platform (self-healing, WebSocket telemetry).</w:t>
       </w:r>
     </w:p>
-    <w:p ns2:paraId="6A8D4D4D" ns2:textId="21718839">
+    <w:p>
       <w:pPr>
         <w:spacing w:after="50" w:line="240" w:lineRule="auto"/>
         <w:ind w:left="180" w:hanging="180"/>
@@ -2946,18 +2946,18 @@
         <w:t>• AI-native full stack with frontier models: fast iteration, test-driven validation, repo norms, reproducible upstream delivery.</w:t>
       </w:r>
     </w:p>
-    <w:p ns2:paraId="29A43009" ns2:textId="77777777">
-      <w:pPr>
-        <w:spacing w:after="50" w:line="240" w:lineRule="auto"/>
-        <w:ind w:left="180" w:hanging="180"/>
-        <w:rPr>
-          <w:rFonts w:ascii="Arial" w:hAnsi="Arial" w:cs="Arial"/>
-          <w:sz w:val="22"/>
-          <w:szCs w:val="22"/>
-        </w:rPr>
-      </w:pPr>
-    </w:p>
-    <w:p ns2:paraId="49DB7C82" ns2:textId="77777777">
+    <w:p>
+      <w:pPr>
+        <w:spacing w:after="50" w:line="240" w:lineRule="auto"/>
+        <w:ind w:left="180" w:hanging="180"/>
+        <w:rPr>
+          <w:rFonts w:ascii="Arial" w:hAnsi="Arial" w:cs="Arial"/>
+          <w:sz w:val="22"/>
+          <w:szCs w:val="22"/>
+        </w:rPr>
+      </w:pPr>
+    </w:p>
+    <w:p>
       <w:pPr>
         <w:spacing w:after="60" w:line="240" w:lineRule="auto"/>
         <w:rPr>
@@ -2975,7 +2975,7 @@
         <w:t>Quantitative Crypto Trader &amp; Derivatives Strategist | September 2016 - Present | Remote</w:t>
       </w:r>
     </w:p>
-    <w:p ns2:paraId="04445289" ns2:textId="77777777">
+    <w:p>
       <w:pPr>
         <w:spacing w:after="50" w:line="240" w:lineRule="auto"/>
         <w:ind w:left="180" w:hanging="180"/>
@@ -2994,7 +2994,7 @@
         <w:t>• Manage diversified proprietary capital across tier-1 exchanges including Binance, Coinbase, Bitget.</w:t>
       </w:r>
     </w:p>
-    <w:p ns2:paraId="4C1EF3F0" ns2:textId="77777777">
+    <w:p>
       <w:pPr>
         <w:spacing w:after="50" w:line="240" w:lineRule="auto"/>
         <w:ind w:left="180" w:hanging="180"/>
@@ -3013,7 +3013,7 @@
         <w:t>• Built and ran automated grid, DCA, and Martingale bots on Pionex and Binance to capture spread and volatility in ranging markets.</w:t>
       </w:r>
     </w:p>
-    <w:p ns2:paraId="5A81116E" ns2:textId="77777777">
+    <w:p>
       <w:pPr>
         <w:spacing w:after="50" w:line="240" w:lineRule="auto"/>
         <w:ind w:left="180" w:hanging="180"/>
@@ -3032,7 +3032,7 @@
         <w:t>• Executed delta-neutral basis and funding-rate arbitrage between spot and perpetuals, plus concentrated-liquidity and lending-loop strategies on-chain.</w:t>
       </w:r>
     </w:p>
-    <w:p ns2:paraId="2486A199" ns2:textId="77777777">
+    <w:p>
       <w:pPr>
         <w:spacing w:after="50" w:line="240" w:lineRule="auto"/>
         <w:ind w:left="180" w:hanging="180"/>
@@ -3069,7 +3069,7 @@
         <w:t xml:space="preserve"> limits, drawdown caps, and Sharpe-ratio optimization governing position sizing and portfolio.</w:t>
       </w:r>
     </w:p>
-    <w:p ns2:paraId="5BF22EFD" ns2:textId="7AA5F2DA">
+    <w:p>
       <w:pPr>
         <w:pBdr>
           <w:bottom w:val="single" w:sz="6" w:space="1" w:color="666666"/>
@@ -3094,7 +3094,7 @@
         <w:t>ertifications</w:t>
       </w:r>
     </w:p>
-    <w:p ns2:paraId="750199E4" ns2:textId="3E75D6B1">
+    <w:p>
       <w:pPr>
         <w:spacing w:after="50" w:line="240" w:lineRule="auto"/>
         <w:ind w:left="180" w:hanging="180"/>
@@ -3132,7 +3132,7 @@
         <w:t>: Advanced Topics - Anthropic, 2026</w:t>
       </w:r>
     </w:p>
-    <w:p ns2:paraId="5979B4F1" ns2:textId="3E88C790">
+    <w:p>
       <w:pPr>
         <w:spacing w:after="50" w:line="240" w:lineRule="auto"/>
         <w:ind w:left="180" w:hanging="180"/>
@@ -3170,7 +3170,7 @@
         <w:t xml:space="preserve"> - Anthropic (with CodePath), 2026</w:t>
       </w:r>
     </w:p>
-    <w:p ns2:paraId="2D1F57CB" ns2:textId="6377C20D">
+    <w:p>
       <w:pPr>
         <w:spacing w:after="50" w:line="240" w:lineRule="auto"/>
         <w:ind w:left="180" w:hanging="180"/>
@@ -3208,7 +3208,7 @@
         <w:t xml:space="preserve"> - OpenAI Academy, 2026</w:t>
       </w:r>
     </w:p>
-    <w:p ns2:paraId="2677E336" ns2:textId="0913D9DA">
+    <w:p>
       <w:pPr>
         <w:spacing w:after="50" w:line="240" w:lineRule="auto"/>
         <w:ind w:left="180" w:hanging="180"/>
@@ -3246,7 +3246,7 @@
         <w:t xml:space="preserve"> - LangChain Academy, 2026</w:t>
       </w:r>
     </w:p>
-    <w:p ns2:paraId="605447A3" ns2:textId="0A65C822">
+    <w:p>
       <w:pPr>
         <w:spacing w:after="50" w:line="240" w:lineRule="auto"/>
         <w:ind w:left="180" w:hanging="180"/>
@@ -3284,7 +3284,7 @@
         <w:t xml:space="preserve"> - LangChain Academy, 2026</w:t>
       </w:r>
     </w:p>
-    <w:p ns2:paraId="07FF0290" ns2:textId="211EA98B">
+    <w:p>
       <w:pPr>
         <w:spacing w:after="50" w:line="240" w:lineRule="auto"/>
         <w:ind w:left="180" w:hanging="180"/>
@@ -3340,7 +3340,7 @@
         <w:t xml:space="preserve"> with Python Professional Certificate - Google, 2020</w:t>
       </w:r>
     </w:p>
-    <w:p ns2:paraId="1C4D1AD3" ns2:textId="5D28B3F3">
+    <w:p>
       <w:pPr>
         <w:spacing w:after="50" w:line="240" w:lineRule="auto"/>
         <w:ind w:left="180" w:hanging="180"/>
@@ -3378,7 +3378,7 @@
         <w:t>: Azure Fundamentals (AZ-900) - Microsoft, 2020</w:t>
       </w:r>
     </w:p>
-    <w:p ns2:paraId="194C7514" ns2:textId="1C36E1FC">
+    <w:p>
       <w:pPr>
         <w:spacing w:after="50" w:line="240" w:lineRule="auto"/>
         <w:ind w:left="180" w:hanging="180"/>
@@ -3416,7 +3416,7 @@
         <w:t xml:space="preserve"> - Johns Hopkins University (Coursera), 2020</w:t>
       </w:r>
     </w:p>
-    <w:p ns2:paraId="5DC61C4C" ns2:textId="564BA67C">
+    <w:p>
       <w:pPr>
         <w:spacing w:after="50" w:line="240" w:lineRule="auto"/>
         <w:ind w:left="180" w:hanging="180"/>
@@ -3454,7 +3454,7 @@
         <w:t xml:space="preserve"> Professional Certificate - DeepLearning.AI, 2020</w:t>
       </w:r>
     </w:p>
-    <w:p ns2:paraId="1506E923" ns2:textId="7C0BBEAF">
+    <w:p>
       <w:pPr>
         <w:spacing w:after="50" w:line="240" w:lineRule="auto"/>
         <w:ind w:left="180" w:hanging="180"/>
@@ -3492,7 +3492,7 @@
         <w:t xml:space="preserve"> Professional Certificate - Google, 2020</w:t>
       </w:r>
     </w:p>
-    <w:p ns2:paraId="550AC5A0" ns2:textId="62B883C0">
+    <w:p>
       <w:pPr>
         <w:spacing w:after="50" w:line="240" w:lineRule="auto"/>
         <w:ind w:left="180" w:hanging="180"/>
@@ -3530,7 +3530,7 @@
         <w:t xml:space="preserve"> Specialization - Amazon Web Services (Coursera), 2020</w:t>
       </w:r>
     </w:p>
-    <w:p ns2:paraId="25342D99" ns2:textId="199B4F74">
+    <w:p>
       <w:pPr>
         <w:spacing w:after="50" w:line="240" w:lineRule="auto"/>
         <w:ind w:left="180" w:hanging="180"/>
@@ -3568,7 +3568,7 @@
         <w:t xml:space="preserve"> - Kennesaw State University (Coursera), 2020</w:t>
       </w:r>
     </w:p>
-    <w:p ns2:paraId="14388806" ns2:textId="479C8845">
+    <w:p>
       <w:pPr>
         <w:spacing w:after="50" w:line="240" w:lineRule="auto"/>
         <w:ind w:left="180" w:hanging="180"/>
@@ -3607,7 +3607,7 @@
         <w:t xml:space="preserve"> - DeepLearning.AI, 2020</w:t>
       </w:r>
     </w:p>
-    <w:p ns2:paraId="57C6FDAF" ns2:textId="6C75C962">
+    <w:p>
       <w:pPr>
         <w:spacing w:after="50" w:line="240" w:lineRule="auto"/>
         <w:ind w:left="180" w:hanging="180"/>
@@ -3645,7 +3645,7 @@
         <w:t xml:space="preserve"> Professional Certificate - IBM, 2020</w:t>
       </w:r>
     </w:p>
-    <w:p ns2:paraId="214B3C29" ns2:textId="4ECE0F0C">
+    <w:p>
       <w:pPr>
         <w:spacing w:after="50" w:line="240" w:lineRule="auto"/>
         <w:ind w:left="180" w:hanging="180"/>
@@ -3683,7 +3683,7 @@
         <w:t xml:space="preserve"> - University of California, Irvine (Coursera), 2020</w:t>
       </w:r>
     </w:p>
-    <w:p ns2:paraId="452AAA4C" ns2:textId="5E29ABD1">
+    <w:p>
       <w:pPr>
         <w:pBdr>
           <w:bottom w:val="single" w:sz="6" w:space="1" w:color="666666"/>
@@ -3708,7 +3708,7 @@
         <w:t>ducation</w:t>
       </w:r>
     </w:p>
-    <w:p ns2:paraId="10D4037F" ns2:textId="5E414CFF">
+    <w:p>
       <w:pPr>
         <w:spacing w:before="120" w:after="10" w:line="240" w:lineRule="auto"/>
         <w:rPr>
@@ -3772,7 +3772,7 @@
         <w:t>umbai</w:t>
       </w:r>
     </w:p>
-    <w:p ns2:paraId="3096E978" ns2:textId="77777777">
+    <w:p>
       <w:pPr>
         <w:spacing w:after="60" w:line="240" w:lineRule="auto"/>
         <w:rPr>
@@ -3790,7 +3790,7 @@
         <w:t>Bachelor of Engineering (B.E.), Chemical Engineering (First Class)</w:t>
       </w:r>
     </w:p>
-    <w:p ns2:paraId="28875B44" ns2:textId="0B64B7B7">
+    <w:p>
       <w:pPr>
         <w:spacing w:after="60" w:line="240" w:lineRule="auto"/>
         <w:rPr>

</xml_diff>

<commit_message>
Resume DOCX: uniform grey borders, blue links without underline, top 20 OSS with closing line
</commit_message>
<xml_diff>
--- a/docs/Devayan_Mandal.docx
+++ b/docs/Devayan_Mandal.docx
@@ -77,7 +77,6 @@
           <w:rPr>
             <w:rFonts w:ascii="Arial" w:hAnsi="Arial" w:cs="Arial"/>
             <w:color w:val="0563C1"/>
-            <w:u w:val="single"/>
           </w:rPr>
           <w:t>devayanmandal@gmail.com</w:t>
         </w:r>
@@ -93,7 +92,6 @@
           <w:rPr>
             <w:rFonts w:ascii="Arial" w:hAnsi="Arial" w:cs="Arial"/>
             <w:color w:val="0563C1"/>
-            <w:u w:val="single"/>
           </w:rPr>
           <w:t>linkedin.com/in/dev-ma</w:t>
         </w:r>
@@ -109,7 +107,6 @@
           <w:rPr>
             <w:rFonts w:ascii="Arial" w:hAnsi="Arial" w:cs="Arial"/>
             <w:color w:val="0563C1"/>
-            <w:u w:val="single"/>
           </w:rPr>
           <w:t>github.com/</w:t>
         </w:r>
@@ -118,7 +115,6 @@
           <w:rPr>
             <w:rFonts w:ascii="Arial" w:hAnsi="Arial" w:cs="Arial"/>
             <w:color w:val="0563C1"/>
-            <w:u w:val="single"/>
           </w:rPr>
           <w:t>devtechedge</w:t>
         </w:r>
@@ -632,7 +628,7 @@
     <w:p>
       <w:pPr>
         <w:pBdr>
-          <w:bottom w:val="single" w:sz="6" w:space="1" w:color="auto"/>
+          <w:bottom w:val="single" w:sz="6" w:space="1" w:color="666666"/>
         </w:pBdr>
         <w:spacing w:after="0" w:line="240" w:lineRule="auto"/>
         <w:rPr>
@@ -731,6 +727,7 @@
           <w:rStyle w:val="Hyperlink"/>
           <w:rFonts w:ascii="Arial" w:hAnsi="Arial" w:cs="Arial"/>
           <w:b/>
+          <w:color w:val="0563C1"/>
         </w:rPr>
         <w:t>Merged Open-Source Contributions</w:t>
       </w:r>
@@ -770,7 +767,6 @@
             <w:color w:val="0563C1"/>
             <w:sz w:val="22"/>
             <w:szCs w:val="22"/>
-            <w:u w:val="single"/>
           </w:rPr>
           <w:t>biomejs</w:t>
         </w:r>
@@ -781,7 +777,6 @@
             <w:color w:val="0563C1"/>
             <w:sz w:val="22"/>
             <w:szCs w:val="22"/>
-            <w:u w:val="single"/>
           </w:rPr>
           <w:t>/biome #11667</w:t>
         </w:r>
@@ -839,7 +834,6 @@
             <w:color w:val="0563C1"/>
             <w:sz w:val="22"/>
             <w:szCs w:val="22"/>
-            <w:u w:val="single"/>
           </w:rPr>
           <w:t>pnpm</w:t>
         </w:r>
@@ -850,7 +844,6 @@
             <w:color w:val="0563C1"/>
             <w:sz w:val="22"/>
             <w:szCs w:val="22"/>
-            <w:u w:val="single"/>
           </w:rPr>
           <w:t>/</w:t>
         </w:r>
@@ -861,7 +854,6 @@
             <w:color w:val="0563C1"/>
             <w:sz w:val="22"/>
             <w:szCs w:val="22"/>
-            <w:u w:val="single"/>
           </w:rPr>
           <w:t>pnpm</w:t>
         </w:r>
@@ -872,7 +864,6 @@
             <w:color w:val="0563C1"/>
             <w:sz w:val="22"/>
             <w:szCs w:val="22"/>
-            <w:u w:val="single"/>
           </w:rPr>
           <w:t xml:space="preserve"> #14863</w:t>
         </w:r>
@@ -912,7 +903,6 @@
             <w:color w:val="0563C1"/>
             <w:sz w:val="22"/>
             <w:szCs w:val="22"/>
-            <w:u w:val="single"/>
           </w:rPr>
           <w:t>brianc</w:t>
         </w:r>
@@ -923,7 +913,6 @@
             <w:color w:val="0563C1"/>
             <w:sz w:val="22"/>
             <w:szCs w:val="22"/>
-            <w:u w:val="single"/>
           </w:rPr>
           <w:t>/node-</w:t>
         </w:r>
@@ -934,7 +923,6 @@
             <w:color w:val="0563C1"/>
             <w:sz w:val="22"/>
             <w:szCs w:val="22"/>
-            <w:u w:val="single"/>
           </w:rPr>
           <w:t>postgres</w:t>
         </w:r>
@@ -945,7 +933,6 @@
             <w:color w:val="0563C1"/>
             <w:sz w:val="22"/>
             <w:szCs w:val="22"/>
-            <w:u w:val="single"/>
           </w:rPr>
           <w:t xml:space="preserve"> #3772</w:t>
         </w:r>
@@ -1002,7 +989,6 @@
             <w:color w:val="0563C1"/>
             <w:sz w:val="22"/>
             <w:szCs w:val="22"/>
-            <w:u w:val="single"/>
           </w:rPr>
           <w:t>recharts/recharts #7805</w:t>
         </w:r>
@@ -1059,7 +1045,6 @@
             <w:color w:val="0563C1"/>
             <w:sz w:val="22"/>
             <w:szCs w:val="22"/>
-            <w:u w:val="single"/>
           </w:rPr>
           <w:t>PyO3/</w:t>
         </w:r>
@@ -1070,7 +1055,6 @@
             <w:color w:val="0563C1"/>
             <w:sz w:val="22"/>
             <w:szCs w:val="22"/>
-            <w:u w:val="single"/>
           </w:rPr>
           <w:t>maturin</w:t>
         </w:r>
@@ -1081,7 +1065,6 @@
             <w:color w:val="0563C1"/>
             <w:sz w:val="22"/>
             <w:szCs w:val="22"/>
-            <w:u w:val="single"/>
           </w:rPr>
           <w:t xml:space="preserve"> #3302</w:t>
         </w:r>
@@ -1121,7 +1104,6 @@
             <w:color w:val="0563C1"/>
             <w:sz w:val="22"/>
             <w:szCs w:val="22"/>
-            <w:u w:val="single"/>
           </w:rPr>
           <w:t>SQLMesh</w:t>
         </w:r>
@@ -1132,7 +1114,6 @@
             <w:color w:val="0563C1"/>
             <w:sz w:val="22"/>
             <w:szCs w:val="22"/>
-            <w:u w:val="single"/>
           </w:rPr>
           <w:t>/</w:t>
         </w:r>
@@ -1143,7 +1124,6 @@
             <w:color w:val="0563C1"/>
             <w:sz w:val="22"/>
             <w:szCs w:val="22"/>
-            <w:u w:val="single"/>
           </w:rPr>
           <w:t>sqlmesh</w:t>
         </w:r>
@@ -1154,7 +1134,6 @@
             <w:color w:val="0563C1"/>
             <w:sz w:val="22"/>
             <w:szCs w:val="22"/>
-            <w:u w:val="single"/>
           </w:rPr>
           <w:t xml:space="preserve"> #6040</w:t>
         </w:r>
@@ -1230,7 +1209,6 @@
             <w:color w:val="0563C1"/>
             <w:sz w:val="22"/>
             <w:szCs w:val="22"/>
-            <w:u w:val="single"/>
           </w:rPr>
           <w:t>pnpm</w:t>
         </w:r>
@@ -1241,7 +1219,6 @@
             <w:color w:val="0563C1"/>
             <w:sz w:val="22"/>
             <w:szCs w:val="22"/>
-            <w:u w:val="single"/>
           </w:rPr>
           <w:t>/</w:t>
         </w:r>
@@ -1252,7 +1229,6 @@
             <w:color w:val="0563C1"/>
             <w:sz w:val="22"/>
             <w:szCs w:val="22"/>
-            <w:u w:val="single"/>
           </w:rPr>
           <w:t>pnpm</w:t>
         </w:r>
@@ -1263,7 +1239,6 @@
             <w:color w:val="0563C1"/>
             <w:sz w:val="22"/>
             <w:szCs w:val="22"/>
-            <w:u w:val="single"/>
           </w:rPr>
           <w:t xml:space="preserve"> #14753</w:t>
         </w:r>
@@ -1315,63 +1290,6 @@
         </w:rPr>
         <w:t xml:space="preserve">• </w:t>
       </w:r>
-      <w:hyperlink r:id="rId14" w:history="1">
-        <w:r>
-          <w:rPr>
-            <w:rFonts w:ascii="Arial" w:hAnsi="Arial" w:cs="Arial"/>
-            <w:color w:val="0563C1"/>
-            <w:sz w:val="22"/>
-            <w:szCs w:val="22"/>
-            <w:u w:val="single"/>
-          </w:rPr>
-          <w:t>better-auth/better-auth #11208</w:t>
-        </w:r>
-      </w:hyperlink>
-      <w:r>
-        <w:rPr>
-          <w:rFonts w:ascii="Arial" w:hAnsi="Arial" w:cs="Arial"/>
-          <w:sz w:val="22"/>
-          <w:szCs w:val="22"/>
-        </w:rPr>
-        <w:t xml:space="preserve"> (TypeScript) - added </w:t>
-      </w:r>
-      <w:proofErr w:type="spellStart"/>
-      <w:r>
-        <w:rPr>
-          <w:rFonts w:ascii="Arial" w:hAnsi="Arial" w:cs="Arial"/>
-          <w:sz w:val="22"/>
-          <w:szCs w:val="22"/>
-        </w:rPr>
-        <w:t>OpenAPI</w:t>
-      </w:r>
-      <w:proofErr w:type="spellEnd"/>
-      <w:r>
-        <w:rPr>
-          <w:rFonts w:ascii="Arial" w:hAnsi="Arial" w:cs="Arial"/>
-          <w:sz w:val="22"/>
-          <w:szCs w:val="22"/>
-        </w:rPr>
-        <w:t xml:space="preserve"> regression test for phone verify body; tests only.</w:t>
-      </w:r>
-    </w:p>
-    <w:p>
-      <w:pPr>
-        <w:spacing w:after="50" w:line="240" w:lineRule="auto"/>
-        <w:ind w:left="180" w:hanging="180"/>
-        <w:rPr>
-          <w:rFonts w:ascii="Arial" w:hAnsi="Arial" w:cs="Arial"/>
-          <w:sz w:val="22"/>
-          <w:szCs w:val="22"/>
-        </w:rPr>
-      </w:pPr>
-      <w:r>
-        <w:rPr>
-          <w:rFonts w:ascii="Arial" w:hAnsi="Arial" w:cs="Arial"/>
-          <w:sz w:val="22"/>
-          <w:szCs w:val="22"/>
-        </w:rPr>
-        <w:t xml:space="preserve">• </w:t>
-      </w:r>
       <w:hyperlink r:id="rId15" w:history="1">
         <w:proofErr w:type="spellStart"/>
         <w:r>
@@ -1380,7 +1298,6 @@
             <w:color w:val="0563C1"/>
             <w:sz w:val="22"/>
             <w:szCs w:val="22"/>
-            <w:u w:val="single"/>
           </w:rPr>
           <w:t>thirdweb</w:t>
         </w:r>
@@ -1391,7 +1308,6 @@
             <w:color w:val="0563C1"/>
             <w:sz w:val="22"/>
             <w:szCs w:val="22"/>
-            <w:u w:val="single"/>
           </w:rPr>
           <w:t>-dev/</w:t>
         </w:r>
@@ -1402,7 +1318,6 @@
             <w:color w:val="0563C1"/>
             <w:sz w:val="22"/>
             <w:szCs w:val="22"/>
-            <w:u w:val="single"/>
           </w:rPr>
           <w:t>js</w:t>
         </w:r>
@@ -1413,7 +1328,6 @@
             <w:color w:val="0563C1"/>
             <w:sz w:val="22"/>
             <w:szCs w:val="22"/>
-            <w:u w:val="single"/>
           </w:rPr>
           <w:t xml:space="preserve"> #8938</w:t>
         </w:r>
@@ -1471,7 +1385,6 @@
             <w:color w:val="0563C1"/>
             <w:sz w:val="22"/>
             <w:szCs w:val="22"/>
-            <w:u w:val="single"/>
           </w:rPr>
           <w:t>anza-xyz</w:t>
         </w:r>
@@ -1482,7 +1395,6 @@
             <w:color w:val="0563C1"/>
             <w:sz w:val="22"/>
             <w:szCs w:val="22"/>
-            <w:u w:val="single"/>
           </w:rPr>
           <w:t>/kit #2032</w:t>
         </w:r>
@@ -1539,7 +1451,6 @@
             <w:color w:val="0563C1"/>
             <w:sz w:val="22"/>
             <w:szCs w:val="22"/>
-            <w:u w:val="single"/>
           </w:rPr>
           <w:t>web-infra-dev/</w:t>
         </w:r>
@@ -1550,7 +1461,6 @@
             <w:color w:val="0563C1"/>
             <w:sz w:val="22"/>
             <w:szCs w:val="22"/>
-            <w:u w:val="single"/>
           </w:rPr>
           <w:t>rspress</w:t>
         </w:r>
@@ -1561,7 +1471,6 @@
             <w:color w:val="0563C1"/>
             <w:sz w:val="22"/>
             <w:szCs w:val="22"/>
-            <w:u w:val="single"/>
           </w:rPr>
           <w:t xml:space="preserve"> #3678</w:t>
         </w:r>
@@ -1619,7 +1528,6 @@
             <w:color w:val="0563C1"/>
             <w:sz w:val="22"/>
             <w:szCs w:val="22"/>
-            <w:u w:val="single"/>
           </w:rPr>
           <w:t>pnpm</w:t>
         </w:r>
@@ -1630,7 +1538,6 @@
             <w:color w:val="0563C1"/>
             <w:sz w:val="22"/>
             <w:szCs w:val="22"/>
-            <w:u w:val="single"/>
           </w:rPr>
           <w:t>/</w:t>
         </w:r>
@@ -1641,7 +1548,6 @@
             <w:color w:val="0563C1"/>
             <w:sz w:val="22"/>
             <w:szCs w:val="22"/>
-            <w:u w:val="single"/>
           </w:rPr>
           <w:t>pnpm</w:t>
         </w:r>
@@ -1652,7 +1558,6 @@
             <w:color w:val="0563C1"/>
             <w:sz w:val="22"/>
             <w:szCs w:val="22"/>
-            <w:u w:val="single"/>
           </w:rPr>
           <w:t xml:space="preserve"> #14756</w:t>
         </w:r>
@@ -1720,7 +1625,72 @@
         </w:rPr>
         <w:t xml:space="preserve">• </w:t>
       </w:r>
-      <w:hyperlink r:id="rId19" w:history="1">
+      <w:hyperlink r:id="rId20" w:history="1">
+        <w:r>
+          <w:rPr>
+            <w:rFonts w:ascii="Arial" w:hAnsi="Arial" w:cs="Arial"/>
+            <w:color w:val="0563C1"/>
+            <w:sz w:val="22"/>
+            <w:szCs w:val="22"/>
+          </w:rPr>
+          <w:t>stellar/stellar-docs #2850</w:t>
+        </w:r>
+      </w:hyperlink>
+      <w:r>
+        <w:rPr>
+          <w:rFonts w:ascii="Arial" w:hAnsi="Arial" w:cs="Arial"/>
+          <w:sz w:val="22"/>
+          <w:szCs w:val="22"/>
+        </w:rPr>
+        <w:t xml:space="preserve"> (MDX) - documented --enable-core-manual-close flag: MANUAL_CLOSE config, </w:t>
+      </w:r>
+      <w:proofErr w:type="spellStart"/>
+      <w:r>
+        <w:rPr>
+          <w:rFonts w:ascii="Arial" w:hAnsi="Arial" w:cs="Arial"/>
+          <w:sz w:val="22"/>
+          <w:szCs w:val="22"/>
+        </w:rPr>
+        <w:t>manualclose</w:t>
+      </w:r>
+      <w:proofErr w:type="spellEnd"/>
+      <w:r>
+        <w:rPr>
+          <w:rFonts w:ascii="Arial" w:hAnsi="Arial" w:cs="Arial"/>
+          <w:sz w:val="22"/>
+          <w:szCs w:val="22"/>
+        </w:rPr>
+        <w:t xml:space="preserve"> endpoint.</w:t>
+      </w:r>
+    </w:p>
+    <w:p>
+      <w:pPr>
+        <w:spacing w:after="50" w:line="240" w:lineRule="auto"/>
+        <w:ind w:left="180" w:hanging="180"/>
+        <w:rPr>
+          <w:rFonts w:ascii="Arial" w:hAnsi="Arial" w:cs="Arial"/>
+          <w:sz w:val="22"/>
+          <w:szCs w:val="22"/>
+        </w:rPr>
+      </w:pPr>
+      <w:r>
+        <w:rPr>
+          <w:rFonts w:ascii="Arial" w:hAnsi="Arial" w:cs="Arial"/>
+          <w:sz w:val="22"/>
+          <w:szCs w:val="22"/>
+        </w:rPr>
+        <w:t xml:space="preserve">• </w:t>
+      </w:r>
+      <w:hyperlink r:id="rId21" w:history="1">
+        <w:r>
+          <w:rPr>
+            <w:rFonts w:ascii="Arial" w:hAnsi="Arial" w:cs="Arial"/>
+            <w:color w:val="0563C1"/>
+            <w:sz w:val="22"/>
+            <w:szCs w:val="22"/>
+          </w:rPr>
+          <w:t>leo-aa88/</w:t>
+        </w:r>
         <w:proofErr w:type="spellStart"/>
         <w:r>
           <w:rPr>
@@ -1728,9 +1698,8 @@
             <w:color w:val="0563C1"/>
             <w:sz w:val="22"/>
             <w:szCs w:val="22"/>
-            <w:u w:val="single"/>
-          </w:rPr>
-          <w:t>pytest</w:t>
+          </w:rPr>
+          <w:t>reviewgate</w:t>
         </w:r>
         <w:proofErr w:type="spellEnd"/>
         <w:r>
@@ -1739,9 +1708,84 @@
             <w:color w:val="0563C1"/>
             <w:sz w:val="22"/>
             <w:szCs w:val="22"/>
-            <w:u w:val="single"/>
-          </w:rPr>
-          <w:t>-dev/</w:t>
+          </w:rPr>
+          <w:t xml:space="preserve"> #144</w:t>
+        </w:r>
+      </w:hyperlink>
+      <w:r>
+        <w:rPr>
+          <w:rFonts w:ascii="Arial" w:hAnsi="Arial" w:cs="Arial"/>
+          <w:sz w:val="22"/>
+          <w:szCs w:val="22"/>
+        </w:rPr>
+        <w:t xml:space="preserve"> (Python) - added configurable comment-verbosity check on added lines only.</w:t>
+      </w:r>
+    </w:p>
+    <w:p>
+      <w:pPr>
+        <w:spacing w:after="50" w:line="240" w:lineRule="auto"/>
+        <w:ind w:left="180" w:hanging="180"/>
+        <w:rPr>
+          <w:rFonts w:ascii="Arial" w:hAnsi="Arial" w:cs="Arial"/>
+          <w:sz w:val="22"/>
+          <w:szCs w:val="22"/>
+        </w:rPr>
+      </w:pPr>
+      <w:r>
+        <w:rPr>
+          <w:rFonts w:ascii="Arial" w:hAnsi="Arial" w:cs="Arial"/>
+          <w:sz w:val="22"/>
+          <w:szCs w:val="22"/>
+        </w:rPr>
+        <w:t xml:space="preserve">• </w:t>
+      </w:r>
+      <w:hyperlink r:id="rId22" w:history="1">
+        <w:r>
+          <w:rPr>
+            <w:rFonts w:ascii="Arial" w:hAnsi="Arial" w:cs="Arial"/>
+            <w:color w:val="0563C1"/>
+            <w:sz w:val="22"/>
+            <w:szCs w:val="22"/>
+          </w:rPr>
+          <w:t>stellar/stellar-docs #2849</w:t>
+        </w:r>
+      </w:hyperlink>
+      <w:r>
+        <w:rPr>
+          <w:rFonts w:ascii="Arial" w:hAnsi="Arial" w:cs="Arial"/>
+          <w:sz w:val="22"/>
+          <w:szCs w:val="22"/>
+        </w:rPr>
+        <w:t xml:space="preserve"> (MDX) - fixed address example to propagate Result instead of unwrapping bad XDR.</w:t>
+      </w:r>
+    </w:p>
+    <w:p>
+      <w:pPr>
+        <w:spacing w:after="50" w:line="240" w:lineRule="auto"/>
+        <w:ind w:left="180" w:hanging="180"/>
+        <w:rPr>
+          <w:rFonts w:ascii="Arial" w:hAnsi="Arial" w:cs="Arial"/>
+          <w:sz w:val="22"/>
+          <w:szCs w:val="22"/>
+        </w:rPr>
+      </w:pPr>
+      <w:r>
+        <w:rPr>
+          <w:rFonts w:ascii="Arial" w:hAnsi="Arial" w:cs="Arial"/>
+          <w:sz w:val="22"/>
+          <w:szCs w:val="22"/>
+        </w:rPr>
+        <w:t xml:space="preserve">• </w:t>
+      </w:r>
+      <w:hyperlink r:id="rId24" w:history="1">
+        <w:r>
+          <w:rPr>
+            <w:rFonts w:ascii="Arial" w:hAnsi="Arial" w:cs="Arial"/>
+            <w:color w:val="0563C1"/>
+            <w:sz w:val="22"/>
+            <w:szCs w:val="22"/>
+          </w:rPr>
+          <w:t>stellar/</w:t>
         </w:r>
         <w:proofErr w:type="spellStart"/>
         <w:r>
@@ -1750,9 +1794,8 @@
             <w:color w:val="0563C1"/>
             <w:sz w:val="22"/>
             <w:szCs w:val="22"/>
-            <w:u w:val="single"/>
-          </w:rPr>
-          <w:t>pytest</w:t>
+          </w:rPr>
+          <w:t>js</w:t>
         </w:r>
         <w:proofErr w:type="spellEnd"/>
         <w:r>
@@ -1761,18 +1804,212 @@
             <w:color w:val="0563C1"/>
             <w:sz w:val="22"/>
             <w:szCs w:val="22"/>
-            <w:u w:val="single"/>
-          </w:rPr>
-          <w:t>-env #262</w:t>
-        </w:r>
-      </w:hyperlink>
-      <w:r>
-        <w:rPr>
-          <w:rFonts w:ascii="Arial" w:hAnsi="Arial" w:cs="Arial"/>
-          <w:sz w:val="22"/>
-          <w:szCs w:val="22"/>
-        </w:rPr>
-        <w:t xml:space="preserve"> (Python) - documented </w:t>
+          </w:rPr>
+          <w:t>-stellar-</w:t>
+        </w:r>
+        <w:proofErr w:type="spellStart"/>
+        <w:r>
+          <w:rPr>
+            <w:rFonts w:ascii="Arial" w:hAnsi="Arial" w:cs="Arial"/>
+            <w:color w:val="0563C1"/>
+            <w:sz w:val="22"/>
+            <w:szCs w:val="22"/>
+          </w:rPr>
+          <w:t>sdk</w:t>
+        </w:r>
+        <w:proofErr w:type="spellEnd"/>
+        <w:r>
+          <w:rPr>
+            <w:rFonts w:ascii="Arial" w:hAnsi="Arial" w:cs="Arial"/>
+            <w:color w:val="0563C1"/>
+            <w:sz w:val="22"/>
+            <w:szCs w:val="22"/>
+          </w:rPr>
+          <w:t xml:space="preserve"> #1725</w:t>
+        </w:r>
+      </w:hyperlink>
+      <w:r>
+        <w:rPr>
+          <w:rFonts w:ascii="Arial" w:hAnsi="Arial" w:cs="Arial"/>
+          <w:sz w:val="22"/>
+          <w:szCs w:val="22"/>
+        </w:rPr>
+        <w:t xml:space="preserve"> (TypeScript) - extended docs pipeline to migration pages: Starlight sidebar.</w:t>
+      </w:r>
+    </w:p>
+    <w:p>
+      <w:pPr>
+        <w:spacing w:after="50" w:line="240" w:lineRule="auto"/>
+        <w:ind w:left="180" w:hanging="180"/>
+        <w:rPr>
+          <w:rFonts w:ascii="Arial" w:hAnsi="Arial" w:cs="Arial"/>
+          <w:sz w:val="22"/>
+          <w:szCs w:val="22"/>
+        </w:rPr>
+      </w:pPr>
+      <w:r>
+        <w:rPr>
+          <w:rFonts w:ascii="Arial" w:hAnsi="Arial" w:cs="Arial"/>
+          <w:sz w:val="22"/>
+          <w:szCs w:val="22"/>
+        </w:rPr>
+        <w:lastRenderedPageBreak/>
+        <w:t xml:space="preserve">• </w:t>
+      </w:r>
+      <w:hyperlink r:id="rId25" w:history="1">
+        <w:proofErr w:type="spellStart"/>
+        <w:r>
+          <w:rPr>
+            <w:rFonts w:ascii="Arial" w:hAnsi="Arial" w:cs="Arial"/>
+            <w:color w:val="0563C1"/>
+            <w:sz w:val="22"/>
+            <w:szCs w:val="22"/>
+          </w:rPr>
+          <w:t>EmbarkStudios</w:t>
+        </w:r>
+        <w:proofErr w:type="spellEnd"/>
+        <w:r>
+          <w:rPr>
+            <w:rFonts w:ascii="Arial" w:hAnsi="Arial" w:cs="Arial"/>
+            <w:color w:val="0563C1"/>
+            <w:sz w:val="22"/>
+            <w:szCs w:val="22"/>
+          </w:rPr>
+          <w:t>/cargo-about #319</w:t>
+        </w:r>
+      </w:hyperlink>
+      <w:r>
+        <w:rPr>
+          <w:rFonts w:ascii="Arial" w:hAnsi="Arial" w:cs="Arial"/>
+          <w:sz w:val="22"/>
+          <w:szCs w:val="22"/>
+        </w:rPr>
+        <w:t xml:space="preserve"> (Rust) - closed license quote in </w:t>
+      </w:r>
+      <w:proofErr w:type="spellStart"/>
+      <w:r>
+        <w:rPr>
+          <w:rFonts w:ascii="Arial" w:hAnsi="Arial" w:cs="Arial"/>
+          <w:sz w:val="22"/>
+          <w:szCs w:val="22"/>
+        </w:rPr>
+        <w:t>synthesize_manifest</w:t>
+      </w:r>
+      <w:proofErr w:type="spellEnd"/>
+      <w:r>
+        <w:rPr>
+          <w:rFonts w:ascii="Arial" w:hAnsi="Arial" w:cs="Arial"/>
+          <w:sz w:val="22"/>
+          <w:szCs w:val="22"/>
+        </w:rPr>
+        <w:t xml:space="preserve"> at EOF so output stays valid TOML.</w:t>
+      </w:r>
+    </w:p>
+    <w:p>
+      <w:pPr>
+        <w:spacing w:after="50" w:line="240" w:lineRule="auto"/>
+        <w:ind w:left="180" w:hanging="180"/>
+        <w:rPr>
+          <w:rFonts w:ascii="Arial" w:hAnsi="Arial" w:cs="Arial"/>
+          <w:sz w:val="22"/>
+          <w:szCs w:val="22"/>
+        </w:rPr>
+      </w:pPr>
+      <w:r>
+        <w:rPr>
+          <w:rFonts w:ascii="Arial" w:hAnsi="Arial" w:cs="Arial"/>
+          <w:sz w:val="22"/>
+          <w:szCs w:val="22"/>
+        </w:rPr>
+        <w:t xml:space="preserve">• </w:t>
+      </w:r>
+      <w:hyperlink r:id="rId26" w:history="1">
+        <w:proofErr w:type="spellStart"/>
+        <w:r>
+          <w:rPr>
+            <w:rFonts w:ascii="Arial" w:hAnsi="Arial" w:cs="Arial"/>
+            <w:color w:val="0563C1"/>
+            <w:sz w:val="22"/>
+            <w:szCs w:val="22"/>
+          </w:rPr>
+          <w:t>EmbarkStudios</w:t>
+        </w:r>
+        <w:proofErr w:type="spellEnd"/>
+        <w:r>
+          <w:rPr>
+            <w:rFonts w:ascii="Arial" w:hAnsi="Arial" w:cs="Arial"/>
+            <w:color w:val="0563C1"/>
+            <w:sz w:val="22"/>
+            <w:szCs w:val="22"/>
+          </w:rPr>
+          <w:t>/cargo-about #320</w:t>
+        </w:r>
+      </w:hyperlink>
+      <w:r>
+        <w:rPr>
+          <w:rFonts w:ascii="Arial" w:hAnsi="Arial" w:cs="Arial"/>
+          <w:sz w:val="22"/>
+          <w:szCs w:val="22"/>
+        </w:rPr>
+        <w:t xml:space="preserve"> (Rust) - fixed insert offset to full-manifest coordinates.</w:t>
+      </w:r>
+    </w:p>
+    <w:p>
+      <w:pPr>
+        <w:spacing w:after="50" w:line="240" w:lineRule="auto"/>
+        <w:ind w:left="180" w:hanging="180"/>
+        <w:rPr>
+          <w:rFonts w:ascii="Arial" w:hAnsi="Arial" w:cs="Arial"/>
+          <w:sz w:val="22"/>
+          <w:szCs w:val="22"/>
+        </w:rPr>
+      </w:pPr>
+      <w:r>
+        <w:rPr>
+          <w:rFonts w:ascii="Arial" w:hAnsi="Arial" w:cs="Arial"/>
+          <w:sz w:val="22"/>
+          <w:szCs w:val="22"/>
+        </w:rPr>
+        <w:t xml:space="preserve">• </w:t>
+      </w:r>
+      <w:hyperlink r:id="rId27" w:history="1">
+        <w:r>
+          <w:rPr>
+            <w:rFonts w:ascii="Arial" w:hAnsi="Arial" w:cs="Arial"/>
+            <w:color w:val="0563C1"/>
+            <w:sz w:val="22"/>
+            <w:szCs w:val="22"/>
+          </w:rPr>
+          <w:t>astral-</w:t>
+        </w:r>
+        <w:proofErr w:type="spellStart"/>
+        <w:r>
+          <w:rPr>
+            <w:rFonts w:ascii="Arial" w:hAnsi="Arial" w:cs="Arial"/>
+            <w:color w:val="0563C1"/>
+            <w:sz w:val="22"/>
+            <w:szCs w:val="22"/>
+          </w:rPr>
+          <w:t>sh</w:t>
+        </w:r>
+        <w:proofErr w:type="spellEnd"/>
+        <w:r>
+          <w:rPr>
+            <w:rFonts w:ascii="Arial" w:hAnsi="Arial" w:cs="Arial"/>
+            <w:color w:val="0563C1"/>
+            <w:sz w:val="22"/>
+            <w:szCs w:val="22"/>
+          </w:rPr>
+          <w:t>/ruff #28542</w:t>
+        </w:r>
+      </w:hyperlink>
+      <w:r>
+        <w:rPr>
+          <w:rFonts w:ascii="Arial" w:hAnsi="Arial" w:cs="Arial"/>
+          <w:sz w:val="22"/>
+          <w:szCs w:val="22"/>
+        </w:rPr>
+        <w:t xml:space="preserve"> (Rust) - clarified PYI002 message to name stub-file context for </w:t>
       </w:r>
       <w:proofErr w:type="spellStart"/>
       <w:proofErr w:type="gramStart"/>
@@ -1782,7 +2019,7 @@
           <w:sz w:val="22"/>
           <w:szCs w:val="22"/>
         </w:rPr>
-        <w:t>pytest.toml</w:t>
+        <w:t>sys.platform</w:t>
       </w:r>
       <w:proofErr w:type="spellEnd"/>
       <w:proofErr w:type="gramEnd"/>
@@ -1792,7 +2029,7 @@
           <w:sz w:val="22"/>
           <w:szCs w:val="22"/>
         </w:rPr>
-        <w:t xml:space="preserve"> accepts native [</w:t>
+        <w:t>/</w:t>
       </w:r>
       <w:proofErr w:type="spellStart"/>
       <w:r>
@@ -1801,7 +2038,7 @@
           <w:sz w:val="22"/>
           <w:szCs w:val="22"/>
         </w:rPr>
-        <w:t>pytest</w:t>
+        <w:t>version_info</w:t>
       </w:r>
       <w:proofErr w:type="spellEnd"/>
       <w:r>
@@ -1810,7 +2047,7 @@
           <w:sz w:val="22"/>
           <w:szCs w:val="22"/>
         </w:rPr>
-        <w:t>] env table.</w:t>
+        <w:t xml:space="preserve"> checks.</w:t>
       </w:r>
     </w:p>
     <w:p>
@@ -1831,43 +2068,55 @@
         </w:rPr>
         <w:t xml:space="preserve">• </w:t>
       </w:r>
-      <w:hyperlink r:id="rId20" w:history="1">
-        <w:r>
-          <w:rPr>
-            <w:rFonts w:ascii="Arial" w:hAnsi="Arial" w:cs="Arial"/>
-            <w:color w:val="0563C1"/>
-            <w:sz w:val="22"/>
-            <w:szCs w:val="22"/>
-            <w:u w:val="single"/>
-          </w:rPr>
-          <w:t>stellar/stellar-docs #2850</w:t>
-        </w:r>
-      </w:hyperlink>
-      <w:r>
-        <w:rPr>
-          <w:rFonts w:ascii="Arial" w:hAnsi="Arial" w:cs="Arial"/>
-          <w:sz w:val="22"/>
-          <w:szCs w:val="22"/>
-        </w:rPr>
-        <w:t xml:space="preserve"> (MDX) - documented --enable-core-manual-close flag: MANUAL_CLOSE config, </w:t>
-      </w:r>
-      <w:proofErr w:type="spellStart"/>
-      <w:r>
-        <w:rPr>
-          <w:rFonts w:ascii="Arial" w:hAnsi="Arial" w:cs="Arial"/>
-          <w:sz w:val="22"/>
-          <w:szCs w:val="22"/>
-        </w:rPr>
-        <w:t>manualclose</w:t>
-      </w:r>
-      <w:proofErr w:type="spellEnd"/>
-      <w:r>
-        <w:rPr>
-          <w:rFonts w:ascii="Arial" w:hAnsi="Arial" w:cs="Arial"/>
-          <w:sz w:val="22"/>
-          <w:szCs w:val="22"/>
-        </w:rPr>
-        <w:t xml:space="preserve"> endpoint.</w:t>
+      <w:hyperlink r:id="rId28" w:history="1">
+        <w:proofErr w:type="spellStart"/>
+        <w:r>
+          <w:rPr>
+            <w:rFonts w:ascii="Arial" w:hAnsi="Arial" w:cs="Arial"/>
+            <w:color w:val="0563C1"/>
+            <w:sz w:val="22"/>
+            <w:szCs w:val="22"/>
+          </w:rPr>
+          <w:t>pnpm</w:t>
+        </w:r>
+        <w:proofErr w:type="spellEnd"/>
+        <w:r>
+          <w:rPr>
+            <w:rFonts w:ascii="Arial" w:hAnsi="Arial" w:cs="Arial"/>
+            <w:color w:val="0563C1"/>
+            <w:sz w:val="22"/>
+            <w:szCs w:val="22"/>
+          </w:rPr>
+          <w:t>/</w:t>
+        </w:r>
+        <w:proofErr w:type="spellStart"/>
+        <w:r>
+          <w:rPr>
+            <w:rFonts w:ascii="Arial" w:hAnsi="Arial" w:cs="Arial"/>
+            <w:color w:val="0563C1"/>
+            <w:sz w:val="22"/>
+            <w:szCs w:val="22"/>
+          </w:rPr>
+          <w:t>pnpm</w:t>
+        </w:r>
+        <w:proofErr w:type="spellEnd"/>
+        <w:r>
+          <w:rPr>
+            <w:rFonts w:ascii="Arial" w:hAnsi="Arial" w:cs="Arial"/>
+            <w:color w:val="0563C1"/>
+            <w:sz w:val="22"/>
+            <w:szCs w:val="22"/>
+          </w:rPr>
+          <w:t xml:space="preserve"> #14754</w:t>
+        </w:r>
+      </w:hyperlink>
+      <w:r>
+        <w:rPr>
+          <w:rFonts w:ascii="Arial" w:hAnsi="Arial" w:cs="Arial"/>
+          <w:sz w:val="22"/>
+          <w:szCs w:val="22"/>
+        </w:rPr>
+        <w:t xml:space="preserve"> (Rust) - fixed --no-bail pattern runs to continue and aggregate failures.</w:t>
       </w:r>
     </w:p>
     <w:p>
@@ -1888,16 +2137,15 @@
         </w:rPr>
         <w:t xml:space="preserve">• </w:t>
       </w:r>
-      <w:hyperlink r:id="rId21" w:history="1">
-        <w:r>
-          <w:rPr>
-            <w:rFonts w:ascii="Arial" w:hAnsi="Arial" w:cs="Arial"/>
-            <w:color w:val="0563C1"/>
-            <w:sz w:val="22"/>
-            <w:szCs w:val="22"/>
-            <w:u w:val="single"/>
-          </w:rPr>
-          <w:t>leo-aa88/</w:t>
+      <w:hyperlink r:id="rId30" w:history="1">
+        <w:r>
+          <w:rPr>
+            <w:rFonts w:ascii="Arial" w:hAnsi="Arial" w:cs="Arial"/>
+            <w:color w:val="0563C1"/>
+            <w:sz w:val="22"/>
+            <w:szCs w:val="22"/>
+          </w:rPr>
+          <w:t>ssf0409/</w:t>
         </w:r>
         <w:proofErr w:type="spellStart"/>
         <w:r>
@@ -1906,9 +2154,8 @@
             <w:color w:val="0563C1"/>
             <w:sz w:val="22"/>
             <w:szCs w:val="22"/>
-            <w:u w:val="single"/>
-          </w:rPr>
-          <w:t>reviewgate</w:t>
+          </w:rPr>
+          <w:t>tracelens</w:t>
         </w:r>
         <w:proofErr w:type="spellEnd"/>
         <w:r>
@@ -1917,383 +2164,17 @@
             <w:color w:val="0563C1"/>
             <w:sz w:val="22"/>
             <w:szCs w:val="22"/>
-            <w:u w:val="single"/>
-          </w:rPr>
-          <w:t xml:space="preserve"> #144</w:t>
-        </w:r>
-      </w:hyperlink>
-      <w:r>
-        <w:rPr>
-          <w:rFonts w:ascii="Arial" w:hAnsi="Arial" w:cs="Arial"/>
-          <w:sz w:val="22"/>
-          <w:szCs w:val="22"/>
-        </w:rPr>
-        <w:t xml:space="preserve"> (Python) - added configurable comment-verbosity check on added lines only.</w:t>
-      </w:r>
-    </w:p>
-    <w:p>
-      <w:pPr>
-        <w:spacing w:after="50" w:line="240" w:lineRule="auto"/>
-        <w:ind w:left="180" w:hanging="180"/>
-        <w:rPr>
-          <w:rFonts w:ascii="Arial" w:hAnsi="Arial" w:cs="Arial"/>
-          <w:sz w:val="22"/>
-          <w:szCs w:val="22"/>
-        </w:rPr>
-      </w:pPr>
-      <w:r>
-        <w:rPr>
-          <w:rFonts w:ascii="Arial" w:hAnsi="Arial" w:cs="Arial"/>
-          <w:sz w:val="22"/>
-          <w:szCs w:val="22"/>
-        </w:rPr>
-        <w:t xml:space="preserve">• </w:t>
-      </w:r>
-      <w:hyperlink r:id="rId22" w:history="1">
-        <w:r>
-          <w:rPr>
-            <w:rFonts w:ascii="Arial" w:hAnsi="Arial" w:cs="Arial"/>
-            <w:color w:val="0563C1"/>
-            <w:sz w:val="22"/>
-            <w:szCs w:val="22"/>
-            <w:u w:val="single"/>
-          </w:rPr>
-          <w:t>stellar/stellar-docs #2849</w:t>
-        </w:r>
-      </w:hyperlink>
-      <w:r>
-        <w:rPr>
-          <w:rFonts w:ascii="Arial" w:hAnsi="Arial" w:cs="Arial"/>
-          <w:sz w:val="22"/>
-          <w:szCs w:val="22"/>
-        </w:rPr>
-        <w:t xml:space="preserve"> (MDX) - fixed address example to propagate Result instead of unwrapping bad XDR.</w:t>
-      </w:r>
-    </w:p>
-    <w:p>
-      <w:pPr>
-        <w:spacing w:after="50" w:line="240" w:lineRule="auto"/>
-        <w:ind w:left="180" w:hanging="180"/>
-        <w:rPr>
-          <w:rFonts w:ascii="Arial" w:hAnsi="Arial" w:cs="Arial"/>
-          <w:sz w:val="22"/>
-          <w:szCs w:val="22"/>
-        </w:rPr>
-      </w:pPr>
-      <w:r>
-        <w:rPr>
-          <w:rFonts w:ascii="Arial" w:hAnsi="Arial" w:cs="Arial"/>
-          <w:sz w:val="22"/>
-          <w:szCs w:val="22"/>
-        </w:rPr>
-        <w:t xml:space="preserve">• </w:t>
-      </w:r>
-      <w:hyperlink r:id="rId23" w:history="1">
-        <w:r>
-          <w:rPr>
-            <w:rFonts w:ascii="Arial" w:hAnsi="Arial" w:cs="Arial"/>
-            <w:color w:val="0563C1"/>
-            <w:sz w:val="22"/>
-            <w:szCs w:val="22"/>
-            <w:u w:val="single"/>
-          </w:rPr>
-          <w:t>leo-aa88/</w:t>
-        </w:r>
-        <w:proofErr w:type="spellStart"/>
-        <w:r>
-          <w:rPr>
-            <w:rFonts w:ascii="Arial" w:hAnsi="Arial" w:cs="Arial"/>
-            <w:color w:val="0563C1"/>
-            <w:sz w:val="22"/>
-            <w:szCs w:val="22"/>
-            <w:u w:val="single"/>
-          </w:rPr>
-          <w:t>reviewgate</w:t>
-        </w:r>
-        <w:proofErr w:type="spellEnd"/>
-        <w:r>
-          <w:rPr>
-            <w:rFonts w:ascii="Arial" w:hAnsi="Arial" w:cs="Arial"/>
-            <w:color w:val="0563C1"/>
-            <w:sz w:val="22"/>
-            <w:szCs w:val="22"/>
-            <w:u w:val="single"/>
-          </w:rPr>
-          <w:t xml:space="preserve"> #172</w:t>
-        </w:r>
-      </w:hyperlink>
-      <w:r>
-        <w:rPr>
-          <w:rFonts w:ascii="Arial" w:hAnsi="Arial" w:cs="Arial"/>
-          <w:sz w:val="22"/>
-          <w:szCs w:val="22"/>
-        </w:rPr>
-        <w:t xml:space="preserve"> (Python) - aligned DESIGN.md 10.14 Hunk entry.</w:t>
-      </w:r>
-    </w:p>
-    <w:p>
-      <w:pPr>
-        <w:spacing w:after="50" w:line="240" w:lineRule="auto"/>
-        <w:ind w:left="180" w:hanging="180"/>
-        <w:rPr>
-          <w:rFonts w:ascii="Arial" w:hAnsi="Arial" w:cs="Arial"/>
-          <w:sz w:val="22"/>
-          <w:szCs w:val="22"/>
-        </w:rPr>
-      </w:pPr>
-      <w:r>
-        <w:rPr>
-          <w:rFonts w:ascii="Arial" w:hAnsi="Arial" w:cs="Arial"/>
-          <w:sz w:val="22"/>
-          <w:szCs w:val="22"/>
-        </w:rPr>
-        <w:t xml:space="preserve">• </w:t>
-      </w:r>
-      <w:hyperlink r:id="rId24" w:history="1">
-        <w:r>
-          <w:rPr>
-            <w:rFonts w:ascii="Arial" w:hAnsi="Arial" w:cs="Arial"/>
-            <w:color w:val="0563C1"/>
-            <w:sz w:val="22"/>
-            <w:szCs w:val="22"/>
-            <w:u w:val="single"/>
-          </w:rPr>
-          <w:t>stellar/</w:t>
-        </w:r>
-        <w:proofErr w:type="spellStart"/>
-        <w:r>
-          <w:rPr>
-            <w:rFonts w:ascii="Arial" w:hAnsi="Arial" w:cs="Arial"/>
-            <w:color w:val="0563C1"/>
-            <w:sz w:val="22"/>
-            <w:szCs w:val="22"/>
-            <w:u w:val="single"/>
-          </w:rPr>
-          <w:t>js</w:t>
-        </w:r>
-        <w:proofErr w:type="spellEnd"/>
-        <w:r>
-          <w:rPr>
-            <w:rFonts w:ascii="Arial" w:hAnsi="Arial" w:cs="Arial"/>
-            <w:color w:val="0563C1"/>
-            <w:sz w:val="22"/>
-            <w:szCs w:val="22"/>
-            <w:u w:val="single"/>
-          </w:rPr>
-          <w:t>-stellar-</w:t>
-        </w:r>
-        <w:proofErr w:type="spellStart"/>
-        <w:r>
-          <w:rPr>
-            <w:rFonts w:ascii="Arial" w:hAnsi="Arial" w:cs="Arial"/>
-            <w:color w:val="0563C1"/>
-            <w:sz w:val="22"/>
-            <w:szCs w:val="22"/>
-            <w:u w:val="single"/>
-          </w:rPr>
-          <w:t>sdk</w:t>
-        </w:r>
-        <w:proofErr w:type="spellEnd"/>
-        <w:r>
-          <w:rPr>
-            <w:rFonts w:ascii="Arial" w:hAnsi="Arial" w:cs="Arial"/>
-            <w:color w:val="0563C1"/>
-            <w:sz w:val="22"/>
-            <w:szCs w:val="22"/>
-            <w:u w:val="single"/>
-          </w:rPr>
-          <w:t xml:space="preserve"> #1725</w:t>
-        </w:r>
-      </w:hyperlink>
-      <w:r>
-        <w:rPr>
-          <w:rFonts w:ascii="Arial" w:hAnsi="Arial" w:cs="Arial"/>
-          <w:sz w:val="22"/>
-          <w:szCs w:val="22"/>
-        </w:rPr>
-        <w:t xml:space="preserve"> (TypeScript) - extended docs pipeline to migration pages: Starlight sidebar.</w:t>
-      </w:r>
-    </w:p>
-    <w:p>
-      <w:pPr>
-        <w:spacing w:after="50" w:line="240" w:lineRule="auto"/>
-        <w:ind w:left="180" w:hanging="180"/>
-        <w:rPr>
-          <w:rFonts w:ascii="Arial" w:hAnsi="Arial" w:cs="Arial"/>
-          <w:sz w:val="22"/>
-          <w:szCs w:val="22"/>
-        </w:rPr>
-      </w:pPr>
-      <w:r>
-        <w:rPr>
-          <w:rFonts w:ascii="Arial" w:hAnsi="Arial" w:cs="Arial"/>
-          <w:sz w:val="22"/>
-          <w:szCs w:val="22"/>
-        </w:rPr>
-        <w:lastRenderedPageBreak/>
-        <w:t xml:space="preserve">• </w:t>
-      </w:r>
-      <w:hyperlink r:id="rId25" w:history="1">
-        <w:proofErr w:type="spellStart"/>
-        <w:r>
-          <w:rPr>
-            <w:rFonts w:ascii="Arial" w:hAnsi="Arial" w:cs="Arial"/>
-            <w:color w:val="0563C1"/>
-            <w:sz w:val="22"/>
-            <w:szCs w:val="22"/>
-            <w:u w:val="single"/>
-          </w:rPr>
-          <w:t>EmbarkStudios</w:t>
-        </w:r>
-        <w:proofErr w:type="spellEnd"/>
-        <w:r>
-          <w:rPr>
-            <w:rFonts w:ascii="Arial" w:hAnsi="Arial" w:cs="Arial"/>
-            <w:color w:val="0563C1"/>
-            <w:sz w:val="22"/>
-            <w:szCs w:val="22"/>
-            <w:u w:val="single"/>
-          </w:rPr>
-          <w:t>/cargo-about #319</w:t>
-        </w:r>
-      </w:hyperlink>
-      <w:r>
-        <w:rPr>
-          <w:rFonts w:ascii="Arial" w:hAnsi="Arial" w:cs="Arial"/>
-          <w:sz w:val="22"/>
-          <w:szCs w:val="22"/>
-        </w:rPr>
-        <w:t xml:space="preserve"> (Rust) - closed license quote in </w:t>
-      </w:r>
-      <w:proofErr w:type="spellStart"/>
-      <w:r>
-        <w:rPr>
-          <w:rFonts w:ascii="Arial" w:hAnsi="Arial" w:cs="Arial"/>
-          <w:sz w:val="22"/>
-          <w:szCs w:val="22"/>
-        </w:rPr>
-        <w:t>synthesize_manifest</w:t>
-      </w:r>
-      <w:proofErr w:type="spellEnd"/>
-      <w:r>
-        <w:rPr>
-          <w:rFonts w:ascii="Arial" w:hAnsi="Arial" w:cs="Arial"/>
-          <w:sz w:val="22"/>
-          <w:szCs w:val="22"/>
-        </w:rPr>
-        <w:t xml:space="preserve"> at EOF so output stays valid TOML.</w:t>
-      </w:r>
-    </w:p>
-    <w:p>
-      <w:pPr>
-        <w:spacing w:after="50" w:line="240" w:lineRule="auto"/>
-        <w:ind w:left="180" w:hanging="180"/>
-        <w:rPr>
-          <w:rFonts w:ascii="Arial" w:hAnsi="Arial" w:cs="Arial"/>
-          <w:sz w:val="22"/>
-          <w:szCs w:val="22"/>
-        </w:rPr>
-      </w:pPr>
-      <w:r>
-        <w:rPr>
-          <w:rFonts w:ascii="Arial" w:hAnsi="Arial" w:cs="Arial"/>
-          <w:sz w:val="22"/>
-          <w:szCs w:val="22"/>
-        </w:rPr>
-        <w:t xml:space="preserve">• </w:t>
-      </w:r>
-      <w:hyperlink r:id="rId26" w:history="1">
-        <w:proofErr w:type="spellStart"/>
-        <w:r>
-          <w:rPr>
-            <w:rFonts w:ascii="Arial" w:hAnsi="Arial" w:cs="Arial"/>
-            <w:color w:val="0563C1"/>
-            <w:sz w:val="22"/>
-            <w:szCs w:val="22"/>
-            <w:u w:val="single"/>
-          </w:rPr>
-          <w:t>EmbarkStudios</w:t>
-        </w:r>
-        <w:proofErr w:type="spellEnd"/>
-        <w:r>
-          <w:rPr>
-            <w:rFonts w:ascii="Arial" w:hAnsi="Arial" w:cs="Arial"/>
-            <w:color w:val="0563C1"/>
-            <w:sz w:val="22"/>
-            <w:szCs w:val="22"/>
-            <w:u w:val="single"/>
-          </w:rPr>
-          <w:t>/cargo-about #320</w:t>
-        </w:r>
-      </w:hyperlink>
-      <w:r>
-        <w:rPr>
-          <w:rFonts w:ascii="Arial" w:hAnsi="Arial" w:cs="Arial"/>
-          <w:sz w:val="22"/>
-          <w:szCs w:val="22"/>
-        </w:rPr>
-        <w:t xml:space="preserve"> (Rust) - fixed insert offset to full-manifest coordinates.</w:t>
-      </w:r>
-    </w:p>
-    <w:p>
-      <w:pPr>
-        <w:spacing w:after="50" w:line="240" w:lineRule="auto"/>
-        <w:ind w:left="180" w:hanging="180"/>
-        <w:rPr>
-          <w:rFonts w:ascii="Arial" w:hAnsi="Arial" w:cs="Arial"/>
-          <w:sz w:val="22"/>
-          <w:szCs w:val="22"/>
-        </w:rPr>
-      </w:pPr>
-      <w:r>
-        <w:rPr>
-          <w:rFonts w:ascii="Arial" w:hAnsi="Arial" w:cs="Arial"/>
-          <w:sz w:val="22"/>
-          <w:szCs w:val="22"/>
-        </w:rPr>
-        <w:t xml:space="preserve">• </w:t>
-      </w:r>
-      <w:hyperlink r:id="rId27" w:history="1">
-        <w:r>
-          <w:rPr>
-            <w:rFonts w:ascii="Arial" w:hAnsi="Arial" w:cs="Arial"/>
-            <w:color w:val="0563C1"/>
-            <w:sz w:val="22"/>
-            <w:szCs w:val="22"/>
-            <w:u w:val="single"/>
-          </w:rPr>
-          <w:t>astral-</w:t>
-        </w:r>
-        <w:proofErr w:type="spellStart"/>
-        <w:r>
-          <w:rPr>
-            <w:rFonts w:ascii="Arial" w:hAnsi="Arial" w:cs="Arial"/>
-            <w:color w:val="0563C1"/>
-            <w:sz w:val="22"/>
-            <w:szCs w:val="22"/>
-            <w:u w:val="single"/>
-          </w:rPr>
-          <w:t>sh</w:t>
-        </w:r>
-        <w:proofErr w:type="spellEnd"/>
-        <w:r>
-          <w:rPr>
-            <w:rFonts w:ascii="Arial" w:hAnsi="Arial" w:cs="Arial"/>
-            <w:color w:val="0563C1"/>
-            <w:sz w:val="22"/>
-            <w:szCs w:val="22"/>
-            <w:u w:val="single"/>
-          </w:rPr>
-          <w:t>/ruff #28542</w:t>
-        </w:r>
-      </w:hyperlink>
-      <w:r>
-        <w:rPr>
-          <w:rFonts w:ascii="Arial" w:hAnsi="Arial" w:cs="Arial"/>
-          <w:sz w:val="22"/>
-          <w:szCs w:val="22"/>
-        </w:rPr>
-        <w:t xml:space="preserve"> (Rust) - clarified PYI002 message to name stub-file context for </w:t>
+          </w:rPr>
+          <w:t xml:space="preserve"> #140</w:t>
+        </w:r>
+      </w:hyperlink>
+      <w:r>
+        <w:rPr>
+          <w:rFonts w:ascii="Arial" w:hAnsi="Arial" w:cs="Arial"/>
+          <w:sz w:val="22"/>
+          <w:szCs w:val="22"/>
+        </w:rPr>
+        <w:t xml:space="preserve"> (Python) - escaped report table cells with </w:t>
       </w:r>
       <w:proofErr w:type="spellStart"/>
       <w:proofErr w:type="gramStart"/>
@@ -2303,7 +2184,7 @@
           <w:sz w:val="22"/>
           <w:szCs w:val="22"/>
         </w:rPr>
-        <w:t>sys.platform</w:t>
+        <w:t>html.escape</w:t>
       </w:r>
       <w:proofErr w:type="spellEnd"/>
       <w:proofErr w:type="gramEnd"/>
@@ -2313,25 +2194,64 @@
           <w:sz w:val="22"/>
           <w:szCs w:val="22"/>
         </w:rPr>
-        <w:t>/</w:t>
-      </w:r>
-      <w:proofErr w:type="spellStart"/>
-      <w:r>
-        <w:rPr>
-          <w:rFonts w:ascii="Arial" w:hAnsi="Arial" w:cs="Arial"/>
-          <w:sz w:val="22"/>
-          <w:szCs w:val="22"/>
-        </w:rPr>
-        <w:t>version_info</w:t>
-      </w:r>
-      <w:proofErr w:type="spellEnd"/>
-      <w:r>
-        <w:rPr>
-          <w:rFonts w:ascii="Arial" w:hAnsi="Arial" w:cs="Arial"/>
-          <w:sz w:val="22"/>
-          <w:szCs w:val="22"/>
-        </w:rPr>
-        <w:t xml:space="preserve"> checks.</w:t>
+        <w:t xml:space="preserve"> so pipes/HTML cannot break summary tables.</w:t>
+      </w:r>
+    </w:p>
+    <w:p>
+      <w:pPr>
+        <w:spacing w:after="50" w:line="240" w:lineRule="auto"/>
+        <w:ind w:left="180" w:hanging="180"/>
+        <w:rPr>
+          <w:rFonts w:ascii="Arial" w:hAnsi="Arial" w:cs="Arial"/>
+          <w:sz w:val="22"/>
+          <w:szCs w:val="22"/>
+        </w:rPr>
+      </w:pPr>
+      <w:r>
+        <w:rPr>
+          <w:rFonts w:ascii="Arial" w:hAnsi="Arial" w:cs="Arial"/>
+          <w:sz w:val="22"/>
+          <w:szCs w:val="22"/>
+        </w:rPr>
+        <w:t xml:space="preserve">20 shown here; 6 more merged upstream across Rust, TypeScript, Python and MDX.</w:t>
+      </w:r>
+    </w:p>
+    <w:p>
+      <w:pPr>
+        <w:spacing w:after="60" w:line="240" w:lineRule="auto"/>
+        <w:rPr>
+          <w:rFonts w:ascii="Arial" w:hAnsi="Arial" w:cs="Arial"/>
+          <w:b/>
+          <w:sz w:val="22"/>
+          <w:szCs w:val="22"/>
+        </w:rPr>
+      </w:pPr>
+    </w:p>
+    <w:p>
+      <w:pPr>
+        <w:spacing w:after="60" w:line="240" w:lineRule="auto"/>
+        <w:rPr>
+          <w:rFonts w:ascii="Arial" w:hAnsi="Arial" w:cs="Arial"/>
+          <w:b/>
+        </w:rPr>
+      </w:pPr>
+      <w:hyperlink r:id="rId33" w:history="1">
+        <w:r>
+          <w:rPr>
+            <w:rStyle w:val="Hyperlink"/>
+            <w:rFonts w:ascii="Arial" w:hAnsi="Arial" w:cs="Arial"/>
+            <w:b/>
+            <w:color w:val="0563C1"/>
+          </w:rPr>
+          <w:t>Projects</w:t>
+        </w:r>
+      </w:hyperlink>
+      <w:r>
+        <w:rPr>
+          <w:rFonts w:ascii="Arial" w:hAnsi="Arial" w:cs="Arial"/>
+          <w:b/>
+        </w:rPr>
+        <w:t>:</w:t>
       </w:r>
     </w:p>
     <w:p>
@@ -2352,59 +2272,24 @@
         </w:rPr>
         <w:t xml:space="preserve">• </w:t>
       </w:r>
-      <w:hyperlink r:id="rId28" w:history="1">
-        <w:proofErr w:type="spellStart"/>
-        <w:r>
-          <w:rPr>
-            <w:rFonts w:ascii="Arial" w:hAnsi="Arial" w:cs="Arial"/>
-            <w:color w:val="0563C1"/>
-            <w:sz w:val="22"/>
-            <w:szCs w:val="22"/>
-            <w:u w:val="single"/>
-          </w:rPr>
-          <w:t>pnpm</w:t>
-        </w:r>
-        <w:proofErr w:type="spellEnd"/>
-        <w:r>
-          <w:rPr>
-            <w:rFonts w:ascii="Arial" w:hAnsi="Arial" w:cs="Arial"/>
-            <w:color w:val="0563C1"/>
-            <w:sz w:val="22"/>
-            <w:szCs w:val="22"/>
-            <w:u w:val="single"/>
-          </w:rPr>
-          <w:t>/</w:t>
-        </w:r>
-        <w:proofErr w:type="spellStart"/>
-        <w:r>
-          <w:rPr>
-            <w:rFonts w:ascii="Arial" w:hAnsi="Arial" w:cs="Arial"/>
-            <w:color w:val="0563C1"/>
-            <w:sz w:val="22"/>
-            <w:szCs w:val="22"/>
-            <w:u w:val="single"/>
-          </w:rPr>
-          <w:t>pnpm</w:t>
-        </w:r>
-        <w:proofErr w:type="spellEnd"/>
-        <w:r>
-          <w:rPr>
-            <w:rFonts w:ascii="Arial" w:hAnsi="Arial" w:cs="Arial"/>
-            <w:color w:val="0563C1"/>
-            <w:sz w:val="22"/>
-            <w:szCs w:val="22"/>
-            <w:u w:val="single"/>
-          </w:rPr>
-          <w:t xml:space="preserve"> #14754</w:t>
-        </w:r>
-      </w:hyperlink>
-      <w:r>
-        <w:rPr>
-          <w:rFonts w:ascii="Arial" w:hAnsi="Arial" w:cs="Arial"/>
-          <w:sz w:val="22"/>
-          <w:szCs w:val="22"/>
-        </w:rPr>
-        <w:t xml:space="preserve"> (Rust) - fixed --no-bail pattern runs to continue and aggregate failures.</w:t>
+      <w:hyperlink r:id="rId34" w:history="1">
+        <w:r>
+          <w:rPr>
+            <w:rFonts w:ascii="Arial" w:hAnsi="Arial" w:cs="Arial"/>
+            <w:color w:val="0563C1"/>
+            <w:sz w:val="22"/>
+            <w:szCs w:val="22"/>
+          </w:rPr>
+          <w:t>Lattice</w:t>
+        </w:r>
+      </w:hyperlink>
+      <w:r>
+        <w:rPr>
+          <w:rFonts w:ascii="Arial" w:hAnsi="Arial" w:cs="Arial"/>
+          <w:sz w:val="22"/>
+          <w:szCs w:val="22"/>
+        </w:rPr>
+        <w:t>: Web3 roles board aggregating 20 crypto teams plus salary observatory.</w:t>
       </w:r>
     </w:p>
     <w:p>
@@ -2425,25 +2310,24 @@
         </w:rPr>
         <w:t xml:space="preserve">• </w:t>
       </w:r>
-      <w:hyperlink r:id="rId29" w:history="1">
-        <w:r>
-          <w:rPr>
-            <w:rFonts w:ascii="Arial" w:hAnsi="Arial" w:cs="Arial"/>
-            <w:color w:val="0563C1"/>
-            <w:sz w:val="22"/>
-            <w:szCs w:val="22"/>
-            <w:u w:val="single"/>
-          </w:rPr>
-          <w:t>stellar/stellar-docs #2859</w:t>
-        </w:r>
-      </w:hyperlink>
-      <w:r>
-        <w:rPr>
-          <w:rFonts w:ascii="Arial" w:hAnsi="Arial" w:cs="Arial"/>
-          <w:sz w:val="22"/>
-          <w:szCs w:val="22"/>
-        </w:rPr>
-        <w:t xml:space="preserve"> (MDX) - added missing --enable-core-manual-close flag to Network Modes Local section.</w:t>
+      <w:hyperlink r:id="rId35" w:history="1">
+        <w:r>
+          <w:rPr>
+            <w:rFonts w:ascii="Arial" w:hAnsi="Arial" w:cs="Arial"/>
+            <w:color w:val="0563C1"/>
+            <w:sz w:val="22"/>
+            <w:szCs w:val="22"/>
+          </w:rPr>
+          <w:t>Jobrow</w:t>
+        </w:r>
+      </w:hyperlink>
+      <w:r>
+        <w:rPr>
+          <w:rFonts w:ascii="Arial" w:hAnsi="Arial" w:cs="Arial"/>
+          <w:sz w:val="22"/>
+          <w:szCs w:val="22"/>
+        </w:rPr>
+        <w:t>: Table-first index of 5,000+ open US tech roles from public APIs.</w:t>
       </w:r>
     </w:p>
     <w:p>
@@ -2464,67 +2348,24 @@
         </w:rPr>
         <w:t xml:space="preserve">• </w:t>
       </w:r>
-      <w:hyperlink r:id="rId30" w:history="1">
-        <w:r>
-          <w:rPr>
-            <w:rFonts w:ascii="Arial" w:hAnsi="Arial" w:cs="Arial"/>
-            <w:color w:val="0563C1"/>
-            <w:sz w:val="22"/>
-            <w:szCs w:val="22"/>
-            <w:u w:val="single"/>
-          </w:rPr>
-          <w:t>ssf0409/</w:t>
-        </w:r>
-        <w:proofErr w:type="spellStart"/>
-        <w:r>
-          <w:rPr>
-            <w:rFonts w:ascii="Arial" w:hAnsi="Arial" w:cs="Arial"/>
-            <w:color w:val="0563C1"/>
-            <w:sz w:val="22"/>
-            <w:szCs w:val="22"/>
-            <w:u w:val="single"/>
-          </w:rPr>
-          <w:t>tracelens</w:t>
-        </w:r>
-        <w:proofErr w:type="spellEnd"/>
-        <w:r>
-          <w:rPr>
-            <w:rFonts w:ascii="Arial" w:hAnsi="Arial" w:cs="Arial"/>
-            <w:color w:val="0563C1"/>
-            <w:sz w:val="22"/>
-            <w:szCs w:val="22"/>
-            <w:u w:val="single"/>
-          </w:rPr>
-          <w:t xml:space="preserve"> #140</w:t>
-        </w:r>
-      </w:hyperlink>
-      <w:r>
-        <w:rPr>
-          <w:rFonts w:ascii="Arial" w:hAnsi="Arial" w:cs="Arial"/>
-          <w:sz w:val="22"/>
-          <w:szCs w:val="22"/>
-        </w:rPr>
-        <w:t xml:space="preserve"> (Python) - escaped report table cells with </w:t>
-      </w:r>
-      <w:proofErr w:type="spellStart"/>
-      <w:proofErr w:type="gramStart"/>
-      <w:r>
-        <w:rPr>
-          <w:rFonts w:ascii="Arial" w:hAnsi="Arial" w:cs="Arial"/>
-          <w:sz w:val="22"/>
-          <w:szCs w:val="22"/>
-        </w:rPr>
-        <w:t>html.escape</w:t>
-      </w:r>
-      <w:proofErr w:type="spellEnd"/>
-      <w:proofErr w:type="gramEnd"/>
-      <w:r>
-        <w:rPr>
-          <w:rFonts w:ascii="Arial" w:hAnsi="Arial" w:cs="Arial"/>
-          <w:sz w:val="22"/>
-          <w:szCs w:val="22"/>
-        </w:rPr>
-        <w:t xml:space="preserve"> so pipes/HTML cannot break summary tables.</w:t>
+      <w:hyperlink r:id="rId36" w:history="1">
+        <w:r>
+          <w:rPr>
+            <w:rFonts w:ascii="Arial" w:hAnsi="Arial" w:cs="Arial"/>
+            <w:color w:val="0563C1"/>
+            <w:sz w:val="22"/>
+            <w:szCs w:val="22"/>
+          </w:rPr>
+          <w:t>Luxe Tracker</w:t>
+        </w:r>
+      </w:hyperlink>
+      <w:r>
+        <w:rPr>
+          <w:rFonts w:ascii="Arial" w:hAnsi="Arial" w:cs="Arial"/>
+          <w:sz w:val="22"/>
+          <w:szCs w:val="22"/>
+        </w:rPr>
+        <w:t>: Luxury price-gap dashboard across 5 maisons, 5 regions, 11k rows.</w:t>
       </w:r>
     </w:p>
     <w:p>
@@ -2545,43 +2386,24 @@
         </w:rPr>
         <w:t xml:space="preserve">• </w:t>
       </w:r>
-      <w:hyperlink r:id="rId31" w:history="1">
-        <w:r>
-          <w:rPr>
-            <w:rFonts w:ascii="Arial" w:hAnsi="Arial" w:cs="Arial"/>
-            <w:color w:val="0563C1"/>
-            <w:sz w:val="22"/>
-            <w:szCs w:val="22"/>
-            <w:u w:val="single"/>
-          </w:rPr>
-          <w:t>stellar/stellar-docs #2853</w:t>
-        </w:r>
-      </w:hyperlink>
-      <w:r>
-        <w:rPr>
-          <w:rFonts w:ascii="Arial" w:hAnsi="Arial" w:cs="Arial"/>
-          <w:sz w:val="22"/>
-          <w:szCs w:val="22"/>
-        </w:rPr>
-        <w:t xml:space="preserve"> (MDX) - clarified pooled accounts guide: memos legacy in use, </w:t>
-      </w:r>
-      <w:proofErr w:type="spellStart"/>
-      <w:r>
-        <w:rPr>
-          <w:rFonts w:ascii="Arial" w:hAnsi="Arial" w:cs="Arial"/>
-          <w:sz w:val="22"/>
-          <w:szCs w:val="22"/>
-        </w:rPr>
-        <w:t>muxed</w:t>
-      </w:r>
-      <w:proofErr w:type="spellEnd"/>
-      <w:r>
-        <w:rPr>
-          <w:rFonts w:ascii="Arial" w:hAnsi="Arial" w:cs="Arial"/>
-          <w:sz w:val="22"/>
-          <w:szCs w:val="22"/>
-        </w:rPr>
-        <w:t xml:space="preserve"> preferred.</w:t>
+      <w:hyperlink r:id="rId37" w:history="1">
+        <w:r>
+          <w:rPr>
+            <w:rFonts w:ascii="Arial" w:hAnsi="Arial" w:cs="Arial"/>
+            <w:color w:val="0563C1"/>
+            <w:sz w:val="22"/>
+            <w:szCs w:val="22"/>
+          </w:rPr>
+          <w:t>Aegis</w:t>
+        </w:r>
+      </w:hyperlink>
+      <w:r>
+        <w:rPr>
+          <w:rFonts w:ascii="Arial" w:hAnsi="Arial" w:cs="Arial"/>
+          <w:sz w:val="22"/>
+          <w:szCs w:val="22"/>
+        </w:rPr>
+        <w:t>: Multi-agent ops cortex with supervisor, HITL gates, live graph view.</w:t>
       </w:r>
     </w:p>
     <w:p>
@@ -2602,81 +2424,24 @@
         </w:rPr>
         <w:t xml:space="preserve">• </w:t>
       </w:r>
-      <w:hyperlink r:id="rId32" w:history="1">
-        <w:r>
-          <w:rPr>
-            <w:rFonts w:ascii="Arial" w:hAnsi="Arial" w:cs="Arial"/>
-            <w:color w:val="0563C1"/>
-            <w:sz w:val="22"/>
-            <w:szCs w:val="22"/>
-            <w:u w:val="single"/>
-          </w:rPr>
-          <w:t>stellar/stellar-docs #2851</w:t>
-        </w:r>
-      </w:hyperlink>
-      <w:r>
-        <w:rPr>
-          <w:rFonts w:ascii="Arial" w:hAnsi="Arial" w:cs="Arial"/>
-          <w:sz w:val="22"/>
-          <w:szCs w:val="22"/>
-        </w:rPr>
-        <w:t xml:space="preserve"> (MDX) - noted localhost is already </w:t>
-      </w:r>
-      <w:proofErr w:type="gramStart"/>
-      <w:r>
-        <w:rPr>
-          <w:rFonts w:ascii="Arial" w:hAnsi="Arial" w:cs="Arial"/>
-          <w:sz w:val="22"/>
-          <w:szCs w:val="22"/>
-        </w:rPr>
-        <w:t>trustworthy,</w:t>
-      </w:r>
-      <w:proofErr w:type="gramEnd"/>
-      <w:r>
-        <w:rPr>
-          <w:rFonts w:ascii="Arial" w:hAnsi="Arial" w:cs="Arial"/>
-          <w:sz w:val="22"/>
-          <w:szCs w:val="22"/>
-        </w:rPr>
-        <w:t xml:space="preserve"> no TLS needed for Freighter.</w:t>
-      </w:r>
-    </w:p>
-    <w:p>
-      <w:pPr>
-        <w:spacing w:after="60" w:line="240" w:lineRule="auto"/>
-        <w:rPr>
-          <w:rFonts w:ascii="Arial" w:hAnsi="Arial" w:cs="Arial"/>
-          <w:b/>
-          <w:sz w:val="22"/>
-          <w:szCs w:val="22"/>
-        </w:rPr>
-      </w:pPr>
-    </w:p>
-    <w:p>
-      <w:pPr>
-        <w:spacing w:after="60" w:line="240" w:lineRule="auto"/>
-        <w:rPr>
-          <w:rFonts w:ascii="Arial" w:hAnsi="Arial" w:cs="Arial"/>
-          <w:b/>
-        </w:rPr>
-      </w:pPr>
-      <w:hyperlink r:id="rId33" w:history="1">
-        <w:r>
-          <w:rPr>
-            <w:rStyle w:val="Hyperlink"/>
-            <w:rFonts w:ascii="Arial" w:hAnsi="Arial" w:cs="Arial"/>
-            <w:b/>
-            <w:color w:val="0563C1"/>
-          </w:rPr>
-          <w:t>Projects</w:t>
-        </w:r>
-      </w:hyperlink>
-      <w:r>
-        <w:rPr>
-          <w:rFonts w:ascii="Arial" w:hAnsi="Arial" w:cs="Arial"/>
-          <w:b/>
-        </w:rPr>
-        <w:t>:</w:t>
+      <w:hyperlink r:id="rId38" w:history="1">
+        <w:r>
+          <w:rPr>
+            <w:rFonts w:ascii="Arial" w:hAnsi="Arial" w:cs="Arial"/>
+            <w:color w:val="0563C1"/>
+            <w:sz w:val="22"/>
+            <w:szCs w:val="22"/>
+          </w:rPr>
+          <w:t>AetherFlow</w:t>
+        </w:r>
+      </w:hyperlink>
+      <w:r>
+        <w:rPr>
+          <w:rFonts w:ascii="Arial" w:hAnsi="Arial" w:cs="Arial"/>
+          <w:sz w:val="22"/>
+          <w:szCs w:val="22"/>
+        </w:rPr>
+        <w:t>: Local-first flowchart IDE with compile, step simulator, time-travel.</w:t>
       </w:r>
     </w:p>
     <w:p>
@@ -2697,201 +2462,6 @@
         </w:rPr>
         <w:t xml:space="preserve">• </w:t>
       </w:r>
-      <w:hyperlink r:id="rId34" w:history="1">
-        <w:r>
-          <w:rPr>
-            <w:rFonts w:ascii="Arial" w:hAnsi="Arial" w:cs="Arial"/>
-            <w:color w:val="0563C1"/>
-            <w:sz w:val="22"/>
-            <w:szCs w:val="22"/>
-            <w:u w:val="single"/>
-          </w:rPr>
-          <w:t>Lattice</w:t>
-        </w:r>
-      </w:hyperlink>
-      <w:r>
-        <w:rPr>
-          <w:rFonts w:ascii="Arial" w:hAnsi="Arial" w:cs="Arial"/>
-          <w:sz w:val="22"/>
-          <w:szCs w:val="22"/>
-        </w:rPr>
-        <w:t>: Web3 roles board aggregating 20 crypto teams plus salary observatory.</w:t>
-      </w:r>
-    </w:p>
-    <w:p>
-      <w:pPr>
-        <w:spacing w:after="50" w:line="240" w:lineRule="auto"/>
-        <w:ind w:left="180" w:hanging="180"/>
-        <w:rPr>
-          <w:rFonts w:ascii="Arial" w:hAnsi="Arial" w:cs="Arial"/>
-          <w:sz w:val="22"/>
-          <w:szCs w:val="22"/>
-        </w:rPr>
-      </w:pPr>
-      <w:r>
-        <w:rPr>
-          <w:rFonts w:ascii="Arial" w:hAnsi="Arial" w:cs="Arial"/>
-          <w:sz w:val="22"/>
-          <w:szCs w:val="22"/>
-        </w:rPr>
-        <w:t xml:space="preserve">• </w:t>
-      </w:r>
-      <w:hyperlink r:id="rId35" w:history="1">
-        <w:r>
-          <w:rPr>
-            <w:rFonts w:ascii="Arial" w:hAnsi="Arial" w:cs="Arial"/>
-            <w:color w:val="0563C1"/>
-            <w:sz w:val="22"/>
-            <w:szCs w:val="22"/>
-            <w:u w:val="single"/>
-          </w:rPr>
-          <w:t>Jobrow</w:t>
-        </w:r>
-      </w:hyperlink>
-      <w:r>
-        <w:rPr>
-          <w:rFonts w:ascii="Arial" w:hAnsi="Arial" w:cs="Arial"/>
-          <w:sz w:val="22"/>
-          <w:szCs w:val="22"/>
-        </w:rPr>
-        <w:t>: Table-first index of 5,000+ open US tech roles from public APIs.</w:t>
-      </w:r>
-    </w:p>
-    <w:p>
-      <w:pPr>
-        <w:spacing w:after="50" w:line="240" w:lineRule="auto"/>
-        <w:ind w:left="180" w:hanging="180"/>
-        <w:rPr>
-          <w:rFonts w:ascii="Arial" w:hAnsi="Arial" w:cs="Arial"/>
-          <w:sz w:val="22"/>
-          <w:szCs w:val="22"/>
-        </w:rPr>
-      </w:pPr>
-      <w:r>
-        <w:rPr>
-          <w:rFonts w:ascii="Arial" w:hAnsi="Arial" w:cs="Arial"/>
-          <w:sz w:val="22"/>
-          <w:szCs w:val="22"/>
-        </w:rPr>
-        <w:t xml:space="preserve">• </w:t>
-      </w:r>
-      <w:hyperlink r:id="rId36" w:history="1">
-        <w:r>
-          <w:rPr>
-            <w:rFonts w:ascii="Arial" w:hAnsi="Arial" w:cs="Arial"/>
-            <w:color w:val="0563C1"/>
-            <w:sz w:val="22"/>
-            <w:szCs w:val="22"/>
-            <w:u w:val="single"/>
-          </w:rPr>
-          <w:t>Luxe Tracker</w:t>
-        </w:r>
-      </w:hyperlink>
-      <w:r>
-        <w:rPr>
-          <w:rFonts w:ascii="Arial" w:hAnsi="Arial" w:cs="Arial"/>
-          <w:sz w:val="22"/>
-          <w:szCs w:val="22"/>
-        </w:rPr>
-        <w:t>: Luxury price-gap dashboard across 5 maisons, 5 regions, 11k rows.</w:t>
-      </w:r>
-    </w:p>
-    <w:p>
-      <w:pPr>
-        <w:spacing w:after="50" w:line="240" w:lineRule="auto"/>
-        <w:ind w:left="180" w:hanging="180"/>
-        <w:rPr>
-          <w:rFonts w:ascii="Arial" w:hAnsi="Arial" w:cs="Arial"/>
-          <w:sz w:val="22"/>
-          <w:szCs w:val="22"/>
-        </w:rPr>
-      </w:pPr>
-      <w:r>
-        <w:rPr>
-          <w:rFonts w:ascii="Arial" w:hAnsi="Arial" w:cs="Arial"/>
-          <w:sz w:val="22"/>
-          <w:szCs w:val="22"/>
-        </w:rPr>
-        <w:t xml:space="preserve">• </w:t>
-      </w:r>
-      <w:hyperlink r:id="rId37" w:history="1">
-        <w:r>
-          <w:rPr>
-            <w:rFonts w:ascii="Arial" w:hAnsi="Arial" w:cs="Arial"/>
-            <w:color w:val="0563C1"/>
-            <w:sz w:val="22"/>
-            <w:szCs w:val="22"/>
-            <w:u w:val="single"/>
-          </w:rPr>
-          <w:t>Aegis</w:t>
-        </w:r>
-      </w:hyperlink>
-      <w:r>
-        <w:rPr>
-          <w:rFonts w:ascii="Arial" w:hAnsi="Arial" w:cs="Arial"/>
-          <w:sz w:val="22"/>
-          <w:szCs w:val="22"/>
-        </w:rPr>
-        <w:t>: Multi-agent ops cortex with supervisor, HITL gates, live graph view.</w:t>
-      </w:r>
-    </w:p>
-    <w:p>
-      <w:pPr>
-        <w:spacing w:after="50" w:line="240" w:lineRule="auto"/>
-        <w:ind w:left="180" w:hanging="180"/>
-        <w:rPr>
-          <w:rFonts w:ascii="Arial" w:hAnsi="Arial" w:cs="Arial"/>
-          <w:sz w:val="22"/>
-          <w:szCs w:val="22"/>
-        </w:rPr>
-      </w:pPr>
-      <w:r>
-        <w:rPr>
-          <w:rFonts w:ascii="Arial" w:hAnsi="Arial" w:cs="Arial"/>
-          <w:sz w:val="22"/>
-          <w:szCs w:val="22"/>
-        </w:rPr>
-        <w:t xml:space="preserve">• </w:t>
-      </w:r>
-      <w:hyperlink r:id="rId38" w:history="1">
-        <w:r>
-          <w:rPr>
-            <w:rFonts w:ascii="Arial" w:hAnsi="Arial" w:cs="Arial"/>
-            <w:color w:val="0563C1"/>
-            <w:sz w:val="22"/>
-            <w:szCs w:val="22"/>
-            <w:u w:val="single"/>
-          </w:rPr>
-          <w:t>AetherFlow</w:t>
-        </w:r>
-      </w:hyperlink>
-      <w:r>
-        <w:rPr>
-          <w:rFonts w:ascii="Arial" w:hAnsi="Arial" w:cs="Arial"/>
-          <w:sz w:val="22"/>
-          <w:szCs w:val="22"/>
-        </w:rPr>
-        <w:t>: Local-first flowchart IDE with compile, step simulator, time-travel.</w:t>
-      </w:r>
-    </w:p>
-    <w:p>
-      <w:pPr>
-        <w:spacing w:after="50" w:line="240" w:lineRule="auto"/>
-        <w:ind w:left="180" w:hanging="180"/>
-        <w:rPr>
-          <w:rFonts w:ascii="Arial" w:hAnsi="Arial" w:cs="Arial"/>
-          <w:sz w:val="22"/>
-          <w:szCs w:val="22"/>
-        </w:rPr>
-      </w:pPr>
-      <w:r>
-        <w:rPr>
-          <w:rFonts w:ascii="Arial" w:hAnsi="Arial" w:cs="Arial"/>
-          <w:sz w:val="22"/>
-          <w:szCs w:val="22"/>
-        </w:rPr>
-        <w:t xml:space="preserve">• </w:t>
-      </w:r>
       <w:hyperlink r:id="rId39" w:history="1">
         <w:r>
           <w:rPr>
@@ -2899,7 +2469,6 @@
             <w:color w:val="0563C1"/>
             <w:sz w:val="22"/>
             <w:szCs w:val="22"/>
-            <w:u w:val="single"/>
           </w:rPr>
           <w:t>Synthesis</w:t>
         </w:r>

</xml_diff>